<commit_message>
Add TSLA predictions for June 2025 to April 2026 in CSV format
</commit_message>
<xml_diff>
--- a/REWRITE/docs/CS_project_Copy_preserved_extended.docx
+++ b/REWRITE/docs/CS_project_Copy_preserved_extended.docx
@@ -1,8 +1,8 @@
 
 <file path=word/document.xml><?xml version="1.0" encoding="utf-8"?>
-<w:document xmlns:ns1="http://schemas.openxmlformats.org/markup-compatibility/2006" xmlns:ns2="http://schemas.microsoft.com/office/word/2010/wordml" xmlns:ns3="http://schemas.openxmlformats.org/drawingml/2006/wordprocessingDrawing" xmlns:ns4="http://schemas.microsoft.com/office/word/2010/wordprocessingDrawing" xmlns:ns5="http://schemas.openxmlformats.org/drawingml/2006/main" xmlns:ns6="http://schemas.openxmlformats.org/drawingml/2006/picture" xmlns:ns8="http://schemas.microsoft.com/office/drawing/2010/main" xmlns:r="http://schemas.openxmlformats.org/officeDocument/2006/relationships" xmlns:w="http://schemas.openxmlformats.org/wordprocessingml/2006/main" ns1:Ignorable="w14 w15 wp14 w16se w16cid w16 w16cex w16sdtdh w16sdtfl">
+<w:document xmlns:mc="http://schemas.openxmlformats.org/markup-compatibility/2006" xmlns:ns5="http://schemas.openxmlformats.org/drawingml/2006/main" xmlns:ns6="http://schemas.openxmlformats.org/drawingml/2006/picture" xmlns:ns8="http://schemas.microsoft.com/office/drawing/2010/main" xmlns:r="http://schemas.openxmlformats.org/officeDocument/2006/relationships" xmlns:w="http://schemas.openxmlformats.org/wordprocessingml/2006/main" xmlns:w14="http://schemas.microsoft.com/office/word/2010/wordml" xmlns:wp="http://schemas.openxmlformats.org/drawingml/2006/wordprocessingDrawing" xmlns:wp14="http://schemas.microsoft.com/office/word/2010/wordprocessingDrawing" mc:Ignorable="w14 w15 wp14 w16se w16cid w16 w16cex w16sdtdh w16sdtfl">
   <w:body>
-    <w:p ns2:paraId="23B4B58B" ns2:textId="4552AB33">
+    <w:p>
       <w:pPr>
         <w:pStyle w:val="Normal"/>
         <w:rPr>
@@ -22,13 +22,13 @@
       </w:pPr>
       <w:r>
         <w:drawing>
-          <ns3:inline ns4:editId="1862B841" ns4:anchorId="3712CCD8">
-            <ns3:extent cx="5648325" cy="8229600"/>
-            <ns3:effectExtent l="0" t="0" r="0" b="0"/>
-            <ns3:docPr id="1824325356" name="drawing" descr="Group 25, Grouped object"/>
-            <ns3:cNvGraphicFramePr>
+          <wp:inline wp14:editId="1862B841" wp14:anchorId="3712CCD8">
+            <wp:extent cx="5648325" cy="8229600"/>
+            <wp:effectExtent l="0" t="0" r="0" b="0"/>
+            <wp:docPr id="1824325356" name="drawing" descr="Group 25, Grouped object"/>
+            <wp:cNvGraphicFramePr>
               <ns5:graphicFrameLocks noChangeAspect="1"/>
-            </ns3:cNvGraphicFramePr>
+            </wp:cNvGraphicFramePr>
             <ns5:graphic>
               <ns5:graphicData uri="http://schemas.openxmlformats.org/drawingml/2006/picture">
                 <ns6:pic>
@@ -60,7 +60,7 @@
                 </ns6:pic>
               </ns5:graphicData>
             </ns5:graphic>
-          </ns3:inline>
+          </wp:inline>
         </w:drawing>
       </w:r>
       <w:r>
@@ -81,7 +81,7 @@
         <w:t xml:space="preserve">  </w:t>
       </w:r>
     </w:p>
-    <w:p ns2:paraId="01F49318" ns2:textId="7CF575CE">
+    <w:p>
       <w:pPr>
         <w:rPr>
           <w:rFonts w:ascii="Aptos" w:hAnsi="Aptos" w:eastAsia="Aptos" w:cs="Aptos"/>
@@ -116,7 +116,7 @@
         <w:t xml:space="preserve">  </w:t>
       </w:r>
     </w:p>
-    <w:p ns2:paraId="52D85822" ns2:textId="37318DE0">
+    <w:p>
       <w:pPr>
         <w:keepNext w:val="1"/>
         <w:keepLines w:val="1"/>
@@ -163,7 +163,7 @@
         </w:docPartObj>
       </w:sdtPr>
       <w:sdtContent>
-        <w:p ns2:paraId="097A46E6" ns2:textId="7AFF0CAC">
+        <w:p>
           <w:pPr>
             <w:pStyle w:val="TOC1"/>
             <w:tabs>
@@ -213,7 +213,7 @@
             </w:r>
           </w:hyperlink>
         </w:p>
-        <w:p ns2:paraId="58DC6A4E" ns2:textId="4D6F455A">
+        <w:p>
           <w:pPr>
             <w:pStyle w:val="TOC2"/>
             <w:tabs>
@@ -254,7 +254,7 @@
             </w:r>
           </w:hyperlink>
         </w:p>
-        <w:p ns2:paraId="144AB178" ns2:textId="4D1FF6B0">
+        <w:p>
           <w:pPr>
             <w:pStyle w:val="TOC1"/>
             <w:tabs>
@@ -295,7 +295,7 @@
             </w:r>
           </w:hyperlink>
         </w:p>
-        <w:p ns2:paraId="2852A47A" ns2:textId="19308F7F">
+        <w:p>
           <w:pPr>
             <w:pStyle w:val="TOC2"/>
             <w:tabs>
@@ -336,7 +336,7 @@
             </w:r>
           </w:hyperlink>
         </w:p>
-        <w:p ns2:paraId="4697CE66" ns2:textId="0A695798">
+        <w:p>
           <w:pPr>
             <w:pStyle w:val="TOC2"/>
             <w:tabs>
@@ -377,7 +377,7 @@
             </w:r>
           </w:hyperlink>
         </w:p>
-        <w:p ns2:paraId="18E340D5" ns2:textId="740913DD">
+        <w:p>
           <w:pPr>
             <w:pStyle w:val="TOC1"/>
             <w:tabs>
@@ -418,7 +418,7 @@
             </w:r>
           </w:hyperlink>
         </w:p>
-        <w:p ns2:paraId="7CCAFAA4" ns2:textId="63FCAF6B">
+        <w:p>
           <w:pPr>
             <w:pStyle w:val="TOC2"/>
             <w:tabs>
@@ -459,7 +459,7 @@
             </w:r>
           </w:hyperlink>
         </w:p>
-        <w:p ns2:paraId="006966DB" ns2:textId="7F8C69C6">
+        <w:p>
           <w:pPr>
             <w:pStyle w:val="TOC2"/>
             <w:tabs>
@@ -500,7 +500,7 @@
             </w:r>
           </w:hyperlink>
         </w:p>
-        <w:p ns2:paraId="12775888" ns2:textId="568FAF2C">
+        <w:p>
           <w:pPr>
             <w:pStyle w:val="TOC2"/>
             <w:tabs>
@@ -541,7 +541,7 @@
             </w:r>
           </w:hyperlink>
         </w:p>
-        <w:p ns2:paraId="679F2FF2" ns2:textId="184E2F6A">
+        <w:p>
           <w:pPr>
             <w:pStyle w:val="TOC2"/>
             <w:tabs>
@@ -582,7 +582,7 @@
             </w:r>
           </w:hyperlink>
         </w:p>
-        <w:p ns2:paraId="708AEF73" ns2:textId="36B39819">
+        <w:p>
           <w:pPr>
             <w:pStyle w:val="TOC1"/>
             <w:tabs>
@@ -623,7 +623,7 @@
             </w:r>
           </w:hyperlink>
         </w:p>
-        <w:p ns2:paraId="70C07DA3" ns2:textId="4BAF9FA2">
+        <w:p>
           <w:pPr>
             <w:pStyle w:val="TOC2"/>
             <w:tabs>
@@ -664,7 +664,7 @@
             </w:r>
           </w:hyperlink>
         </w:p>
-        <w:p ns2:paraId="14A05A27" ns2:textId="1B6D0C2F">
+        <w:p>
           <w:pPr>
             <w:pStyle w:val="TOC2"/>
             <w:tabs>
@@ -705,7 +705,7 @@
             </w:r>
           </w:hyperlink>
         </w:p>
-        <w:p ns2:paraId="13E81404" ns2:textId="27B1246D">
+        <w:p>
           <w:pPr>
             <w:pStyle w:val="TOC2"/>
             <w:tabs>
@@ -746,7 +746,7 @@
             </w:r>
           </w:hyperlink>
         </w:p>
-        <w:p ns2:paraId="2D934CA7" ns2:textId="0072598B">
+        <w:p>
           <w:pPr>
             <w:pStyle w:val="TOC2"/>
             <w:tabs>
@@ -787,7 +787,7 @@
             </w:r>
           </w:hyperlink>
         </w:p>
-        <w:p ns2:paraId="05FB8A44" ns2:textId="22E0C4FA">
+        <w:p>
           <w:pPr>
             <w:pStyle w:val="TOC2"/>
             <w:tabs>
@@ -828,7 +828,7 @@
             </w:r>
           </w:hyperlink>
         </w:p>
-        <w:p ns2:paraId="79913139" ns2:textId="206C0687">
+        <w:p>
           <w:pPr>
             <w:pStyle w:val="TOC2"/>
             <w:tabs>
@@ -869,7 +869,7 @@
             </w:r>
           </w:hyperlink>
         </w:p>
-        <w:p ns2:paraId="7801D56A" ns2:textId="630EC435">
+        <w:p>
           <w:pPr>
             <w:pStyle w:val="TOC2"/>
             <w:tabs>
@@ -910,7 +910,7 @@
             </w:r>
           </w:hyperlink>
         </w:p>
-        <w:p ns2:paraId="18E7DBAF" ns2:textId="3A914910">
+        <w:p>
           <w:pPr>
             <w:pStyle w:val="TOC2"/>
             <w:tabs>
@@ -951,7 +951,7 @@
             </w:r>
           </w:hyperlink>
         </w:p>
-        <w:p ns2:paraId="50679F8B" ns2:textId="05AB38C7">
+        <w:p>
           <w:pPr>
             <w:pStyle w:val="TOC1"/>
             <w:tabs>
@@ -992,7 +992,7 @@
             </w:r>
           </w:hyperlink>
         </w:p>
-        <w:p ns2:paraId="2E663D23" ns2:textId="4D7ED221">
+        <w:p>
           <w:pPr>
             <w:pStyle w:val="TOC1"/>
             <w:tabs>
@@ -1033,7 +1033,7 @@
             </w:r>
           </w:hyperlink>
         </w:p>
-        <w:p ns2:paraId="72C9B97D" ns2:textId="2BFD7FFB">
+        <w:p>
           <w:pPr>
             <w:pStyle w:val="TOC1"/>
             <w:tabs>
@@ -1079,7 +1079,7 @@
         </w:p>
       </w:sdtContent>
     </w:sdt>
-    <w:p ns2:paraId="51AE87F4" ns2:textId="7AA63928">
+    <w:p>
       <w:pPr>
         <w:tabs>
           <w:tab w:val="right" w:leader="dot" w:pos="9015"/>
@@ -1101,7 +1101,7 @@
         </w:rPr>
       </w:pPr>
     </w:p>
-    <w:p ns2:paraId="32B0293E" ns2:textId="5D3DE921">
+    <w:p>
       <w:pPr>
         <w:tabs>
           <w:tab w:val="right" w:leader="dot" w:pos="9015"/>
@@ -1123,7 +1123,7 @@
         </w:rPr>
       </w:pPr>
     </w:p>
-    <w:p ns2:paraId="5A5985D9" ns2:textId="635F39D1">
+    <w:p>
       <w:pPr>
         <w:rPr>
           <w:rFonts w:ascii="Aptos" w:hAnsi="Aptos" w:eastAsia="Aptos" w:cs="Aptos"/>
@@ -1141,7 +1141,7 @@
         </w:rPr>
       </w:pPr>
     </w:p>
-    <w:p ns2:paraId="748C8542" ns2:textId="1CEAA2A2">
+    <w:p>
       <w:pPr>
         <w:rPr>
           <w:rFonts w:ascii="Aptos" w:hAnsi="Aptos" w:eastAsia="Aptos" w:cs="Aptos"/>
@@ -1159,7 +1159,7 @@
         </w:rPr>
       </w:pPr>
     </w:p>
-    <w:p ns2:paraId="3A8B83C0" ns2:textId="221288DB">
+    <w:p>
       <w:pPr>
         <w:pStyle w:val="Heading1"/>
         <w:keepNext w:val="1"/>
@@ -1200,7 +1200,7 @@
       </w:r>
       <w:bookmarkEnd w:id="926311262"/>
     </w:p>
-    <w:p ns2:paraId="72B8643F" ns2:textId="51EE540A">
+    <w:p>
       <w:pPr>
         <w:rPr>
           <w:rFonts w:ascii="Arial" w:hAnsi="Arial" w:eastAsia="Arial" w:cs="Arial"/>
@@ -1218,7 +1218,7 @@
         </w:rPr>
       </w:pPr>
     </w:p>
-    <w:p ns2:paraId="5BE16D7B" ns2:textId="5BE07471">
+    <w:p>
       <w:pPr>
         <w:rPr>
           <w:rFonts w:ascii="Arial" w:hAnsi="Arial" w:eastAsia="Arial" w:cs="Arial"/>
@@ -1239,7 +1239,7 @@
         <w:t>My project is a crypto-tracking platform with a developed front end and back end that reads from and writes to a database so I can store user credentials, assign each account a UUID (Universally Unique Identifier), and let users favourite crypto graphs so they can return to them later. I also planned for the platform to include AI-based market prediction and account profiles if time allowed, because I wanted the finished system to combine practical tracking features with analytical support rather than acting as a simple price viewer.</w:t>
       </w:r>
     </w:p>
-    <w:p ns2:paraId="6FE66891" ns2:textId="71CADBDA">
+    <w:p>
       <w:pPr>
         <w:rPr>
           <w:rFonts w:ascii="Arial" w:hAnsi="Arial" w:eastAsia="Arial" w:cs="Arial"/>
@@ -1260,7 +1260,7 @@
         <w:t>I planned to build the project across several web pages using HTML, CSS, JavaScript, PHP and Python, with SQL databases handling stored credentials and other persistent information. I use Git for version control because the project changes across several languages, files and stages, and I need a reliable record of what I changed, when I changed it and why I changed it. That matters to me because I regularly test risky ideas, such as new model logic, interface changes or database adjustments, and version control gives me a safe checkpoint to return to if an experiment fails. It also lets me compare older and newer versions of the same feature, track how the coursework evolved over time, and show clear evidence of iterative development rather than pretending the final version appeared all at once.</w:t>
       </w:r>
     </w:p>
-    <w:p ns2:paraId="1DD5DC06" ns2:textId="11FFB2B2">
+    <w:p>
       <w:pPr>
         <w:rPr>
           <w:rFonts w:ascii="Arial" w:hAnsi="Arial" w:eastAsia="Arial" w:cs="Arial"/>
@@ -1281,7 +1281,7 @@
         <w:t>For hosting user data in a way that can be accessed over a network, I planned around a Linux environment and a router or modem that could help direct traffic to the website. The website was designed to include a log-in system in which user credentials would be stored in a database inside my Linux Mint environment and then accessed through SQL queries in an external Python script. I also designed a debug menu that would only be reachable through a specific UUID that I would assign to myself. User account UUIDs would be generated with Python's `uuid` library using UUID V4 strings, which rely on random generation so that previously generated IDs are not reused. Those UUIDs would then be stored in an SQL database where I could monitor and edit them when necessary as part of development and testing.</w:t>
       </w:r>
     </w:p>
-    <w:p ns2:paraId="46F7AE83" ns2:textId="05F50AE1">
+    <w:p>
       <w:pPr>
         <w:rPr>
           <w:rFonts w:ascii="Arial" w:hAnsi="Arial" w:eastAsia="Arial" w:cs="Arial"/>
@@ -1299,7 +1299,7 @@
         </w:rPr>
       </w:pPr>
     </w:p>
-    <w:p ns2:paraId="42C7DA23" ns2:textId="03BC2455">
+    <w:p>
       <w:pPr>
         <w:rPr>
           <w:rFonts w:ascii="Arial" w:hAnsi="Arial" w:eastAsia="Arial" w:cs="Arial"/>
@@ -1320,7 +1320,7 @@
         <w:t>I intended the website to be useful for entrepreneurs and shareholders who want to monitor stock market activity while also receiving AI-assisted predictions that could support more informed trading decisions.</w:t>
       </w:r>
     </w:p>
-    <w:p ns2:paraId="0347DABF" ns2:textId="6F473845">
+    <w:p>
       <w:pPr>
         <w:rPr>
           <w:rFonts w:ascii="Arial" w:hAnsi="Arial" w:eastAsia="Arial" w:cs="Arial"/>
@@ -1338,7 +1338,7 @@
         </w:rPr>
       </w:pPr>
     </w:p>
-    <w:p ns2:paraId="07A26652" ns2:textId="0D75A363">
+    <w:p>
       <w:pPr>
         <w:pStyle w:val="Heading2"/>
         <w:keepNext w:val="1"/>
@@ -1399,7 +1399,7 @@
         <w:gridCol w:w="2295"/>
         <w:gridCol w:w="2025"/>
       </w:tblGrid>
-      <w:tr ns2:paraId="3E499144">
+      <w:tr>
         <w:trPr>
           <w:trHeight w:val="300"/>
         </w:trPr>
@@ -1413,7 +1413,7 @@
             </w:tcMar>
             <w:vAlign w:val="top"/>
           </w:tcPr>
-          <w:p ns2:paraId="55B9E330" ns2:textId="75EBB118">
+          <w:p>
             <w:pPr>
               <w:rPr>
                 <w:rFonts w:ascii="Aptos" w:hAnsi="Aptos" w:eastAsia="Aptos" w:cs="Aptos"/>
@@ -1450,7 +1450,7 @@
             </w:tcMar>
             <w:vAlign w:val="top"/>
           </w:tcPr>
-          <w:p ns2:paraId="7139C30A" ns2:textId="385C4FDB">
+          <w:p>
             <w:pPr>
               <w:rPr>
                 <w:rFonts w:ascii="Aptos" w:hAnsi="Aptos" w:eastAsia="Aptos" w:cs="Aptos"/>
@@ -1487,7 +1487,7 @@
             </w:tcMar>
             <w:vAlign w:val="top"/>
           </w:tcPr>
-          <w:p ns2:paraId="5A4A748B" ns2:textId="52309304">
+          <w:p>
             <w:pPr>
               <w:rPr>
                 <w:rFonts w:ascii="Aptos" w:hAnsi="Aptos" w:eastAsia="Aptos" w:cs="Aptos"/>
@@ -1524,7 +1524,7 @@
             </w:tcMar>
             <w:vAlign w:val="top"/>
           </w:tcPr>
-          <w:p ns2:paraId="40AA0A85" ns2:textId="7801CE3E">
+          <w:p>
             <w:pPr>
               <w:rPr>
                 <w:rFonts w:ascii="Aptos" w:hAnsi="Aptos" w:eastAsia="Aptos" w:cs="Aptos"/>
@@ -1552,7 +1552,7 @@
           </w:p>
         </w:tc>
       </w:tr>
-      <w:tr ns2:paraId="46E794EC">
+      <w:tr>
         <w:trPr>
           <w:trHeight w:val="300"/>
         </w:trPr>
@@ -1565,7 +1565,7 @@
             </w:tcMar>
             <w:vAlign w:val="top"/>
           </w:tcPr>
-          <w:p ns2:paraId="792E9BE3" ns2:textId="78CD1F94">
+          <w:p>
             <w:pPr>
               <w:rPr>
                 <w:rFonts w:ascii="Aptos" w:hAnsi="Aptos" w:eastAsia="Aptos" w:cs="Aptos"/>
@@ -1601,7 +1601,7 @@
             </w:tcMar>
             <w:vAlign w:val="top"/>
           </w:tcPr>
-          <w:p ns2:paraId="367E3F5F" ns2:textId="41590D2E">
+          <w:p>
             <w:pPr>
               <w:rPr>
                 <w:rFonts w:ascii="Aptos" w:hAnsi="Aptos" w:eastAsia="Aptos" w:cs="Aptos"/>
@@ -1627,7 +1627,7 @@
             </w:tcMar>
             <w:vAlign w:val="top"/>
           </w:tcPr>
-          <w:p ns2:paraId="1B3AC29A" ns2:textId="613C8197">
+          <w:p>
             <w:pPr>
               <w:rPr>
                 <w:rFonts w:ascii="Aptos" w:hAnsi="Aptos" w:eastAsia="Aptos" w:cs="Aptos"/>
@@ -1653,7 +1653,7 @@
             </w:tcMar>
             <w:vAlign w:val="top"/>
           </w:tcPr>
-          <w:p ns2:paraId="4EBE0361" ns2:textId="79370E7D">
+          <w:p>
             <w:pPr>
               <w:rPr>
                 <w:rFonts w:ascii="Aptos" w:hAnsi="Aptos" w:eastAsia="Aptos" w:cs="Aptos"/>
@@ -1671,7 +1671,7 @@
           </w:p>
         </w:tc>
       </w:tr>
-      <w:tr ns2:paraId="3CAE7088">
+      <w:tr>
         <w:trPr>
           <w:trHeight w:val="300"/>
         </w:trPr>
@@ -1684,7 +1684,7 @@
             </w:tcMar>
             <w:vAlign w:val="top"/>
           </w:tcPr>
-          <w:p ns2:paraId="589E2202" ns2:textId="451D3364">
+          <w:p>
             <w:pPr>
               <w:rPr>
                 <w:rFonts w:ascii="Aptos" w:hAnsi="Aptos" w:eastAsia="Aptos" w:cs="Aptos"/>
@@ -1720,7 +1720,7 @@
             </w:tcMar>
             <w:vAlign w:val="top"/>
           </w:tcPr>
-          <w:p ns2:paraId="73AC02F8" ns2:textId="2D8A1F4E">
+          <w:p>
             <w:pPr>
               <w:rPr>
                 <w:rFonts w:ascii="Aptos" w:hAnsi="Aptos" w:eastAsia="Aptos" w:cs="Aptos"/>
@@ -1746,7 +1746,7 @@
             </w:tcMar>
             <w:vAlign w:val="top"/>
           </w:tcPr>
-          <w:p ns2:paraId="7C66702B" ns2:textId="294F0233">
+          <w:p>
             <w:pPr>
               <w:rPr>
                 <w:rFonts w:ascii="Aptos" w:hAnsi="Aptos" w:eastAsia="Aptos" w:cs="Aptos"/>
@@ -1772,7 +1772,7 @@
             </w:tcMar>
             <w:vAlign w:val="top"/>
           </w:tcPr>
-          <w:p ns2:paraId="4EC4FBF0" ns2:textId="34AD07A8">
+          <w:p>
             <w:pPr>
               <w:rPr>
                 <w:rFonts w:ascii="Aptos" w:hAnsi="Aptos" w:eastAsia="Aptos" w:cs="Aptos"/>
@@ -1790,7 +1790,7 @@
           </w:p>
         </w:tc>
       </w:tr>
-      <w:tr ns2:paraId="46633378">
+      <w:tr>
         <w:trPr>
           <w:trHeight w:val="300"/>
         </w:trPr>
@@ -1803,7 +1803,7 @@
             </w:tcMar>
             <w:vAlign w:val="top"/>
           </w:tcPr>
-          <w:p ns2:paraId="331CA350" ns2:textId="42835794">
+          <w:p>
             <w:pPr>
               <w:rPr>
                 <w:rFonts w:ascii="Aptos" w:hAnsi="Aptos" w:eastAsia="Aptos" w:cs="Aptos"/>
@@ -1839,7 +1839,7 @@
             </w:tcMar>
             <w:vAlign w:val="top"/>
           </w:tcPr>
-          <w:p ns2:paraId="38DEEA28" ns2:textId="367C1EC1">
+          <w:p>
             <w:pPr>
               <w:rPr>
                 <w:rFonts w:ascii="Aptos" w:hAnsi="Aptos" w:eastAsia="Aptos" w:cs="Aptos"/>
@@ -1865,7 +1865,7 @@
             </w:tcMar>
             <w:vAlign w:val="top"/>
           </w:tcPr>
-          <w:p ns2:paraId="42E3C0EC" ns2:textId="2072E616">
+          <w:p>
             <w:pPr>
               <w:rPr>
                 <w:rFonts w:ascii="Aptos" w:hAnsi="Aptos" w:eastAsia="Aptos" w:cs="Aptos"/>
@@ -1891,7 +1891,7 @@
             </w:tcMar>
             <w:vAlign w:val="top"/>
           </w:tcPr>
-          <w:p ns2:paraId="361484FD" ns2:textId="0517834D">
+          <w:p>
             <w:pPr>
               <w:rPr>
                 <w:rFonts w:ascii="Aptos" w:hAnsi="Aptos" w:eastAsia="Aptos" w:cs="Aptos"/>
@@ -1910,7 +1910,7 @@
         </w:tc>
       </w:tr>
     </w:tbl>
-    <w:p ns2:paraId="047CC907" ns2:textId="577C7396">
+    <w:p>
       <w:pPr>
         <w:bidi w:val="0"/>
         <w:rPr>
@@ -1929,7 +1929,7 @@
         </w:rPr>
       </w:pPr>
     </w:p>
-    <w:p ns2:paraId="601A5FAB" ns2:textId="555EE19E">
+    <w:p>
       <w:pPr>
         <w:pStyle w:val="Heading1"/>
         <w:keepNext w:val="1"/>
@@ -1971,7 +1971,7 @@
       </w:r>
       <w:bookmarkEnd w:id="526196005"/>
     </w:p>
-    <w:p ns2:paraId="7FFE1E90" ns2:textId="760FDDD4">
+    <w:p>
       <w:pPr>
         <w:bidi w:val="0"/>
         <w:rPr>
@@ -1990,7 +1990,7 @@
         </w:rPr>
       </w:pPr>
     </w:p>
-    <w:p ns2:paraId="00B7DA76" ns2:textId="4B123FAD">
+    <w:p>
       <w:pPr>
         <w:bidi w:val="0"/>
         <w:rPr>
@@ -2012,7 +2012,7 @@
         <w:t>To judge whether my idea was realistic, I researched examples that already existed online. When I searched for the phrase "Crypto Tracker", I found many websites dedicated to showing crypto prices, graphs and recent market movement for users who need quick access to that information. Some of them also offered predicted values, although those prediction features were usually kept behind paid subscriptions because the owners had invested in training their own AI systems.</w:t>
       </w:r>
     </w:p>
-    <w:p ns2:paraId="6B31D6E9" ns2:textId="7F429508">
+    <w:p>
       <w:pPr>
         <w:pStyle w:val="Heading2"/>
         <w:keepNext w:val="1"/>
@@ -2054,7 +2054,7 @@
       </w:r>
       <w:bookmarkEnd w:id="1523457093"/>
     </w:p>
-    <w:p ns2:paraId="05FC96AE" ns2:textId="4D7738B2">
+    <w:p>
       <w:pPr>
         <w:bidi w:val="0"/>
         <w:rPr>
@@ -2076,7 +2076,7 @@
         <w:t>I found several examples of similar projects that already offered user-friendly layouts and clear metric descriptions, which helped me judge what my own interface and feature set should aim for.</w:t>
       </w:r>
     </w:p>
-    <w:p ns2:paraId="34B641FE" ns2:textId="5FB9B57F">
+    <w:p>
       <w:pPr>
         <w:bidi w:val="0"/>
         <w:rPr>
@@ -2098,7 +2098,7 @@
         <w:t>The first example I evaluated was CoinStats (https://coinstats.app). It uses a dark interface with rounded icons and soft edges, which gives it a sleek and modern look. On the homepage I could immediately see options for connecting portfolios, along with a section showing the top five cryptocurrencies and their price graphs. It also presents percentage change information, and when I selected a coin I was shown a more detailed summary including market cap, price and different viewing modes such as Price, TradingView, MarketCap and AvailableSupply.</w:t>
       </w:r>
     </w:p>
-    <w:p ns2:paraId="781891BA" ns2:textId="5F46CE3C">
+    <w:p>
       <w:pPr>
         <w:bidi w:val="0"/>
         <w:rPr>
@@ -2118,13 +2118,13 @@
       </w:pPr>
       <w:r>
         <w:drawing>
-          <ns3:inline ns4:editId="33829AFA" ns4:anchorId="7BE4D8B1">
-            <ns3:extent cx="5734050" cy="2895600"/>
-            <ns3:effectExtent l="0" t="0" r="0" b="0"/>
-            <ns3:docPr id="73933559" name="drawing" descr="A screenshot of a computer&#10;&#10;AI-generated content may be incorrect."/>
-            <ns3:cNvGraphicFramePr>
+          <wp:inline wp14:editId="33829AFA" wp14:anchorId="7BE4D8B1">
+            <wp:extent cx="5734050" cy="2895600"/>
+            <wp:effectExtent l="0" t="0" r="0" b="0"/>
+            <wp:docPr id="73933559" name="drawing" descr="A screenshot of a computer&#10;&#10;AI-generated content may be incorrect."/>
+            <wp:cNvGraphicFramePr>
               <ns5:graphicFrameLocks noChangeAspect="1"/>
-            </ns3:cNvGraphicFramePr>
+            </wp:cNvGraphicFramePr>
             <ns5:graphic>
               <ns5:graphicData uri="http://schemas.openxmlformats.org/drawingml/2006/picture">
                 <ns6:pic>
@@ -2156,11 +2156,11 @@
                 </ns6:pic>
               </ns5:graphicData>
             </ns5:graphic>
-          </ns3:inline>
+          </wp:inline>
         </w:drawing>
       </w:r>
     </w:p>
-    <w:p ns2:paraId="0B6F4610" ns2:textId="0691E414">
+    <w:p>
       <w:pPr>
         <w:bidi w:val="0"/>
         <w:rPr>
@@ -2180,13 +2180,13 @@
       </w:pPr>
       <w:r>
         <w:drawing>
-          <ns3:inline ns4:editId="79474117" ns4:anchorId="6D483511">
-            <ns3:extent cx="5734050" cy="2895600"/>
-            <ns3:effectExtent l="0" t="0" r="0" b="0"/>
-            <ns3:docPr id="1487176280" name="drawing" descr="A screenshot of a computer&#10;&#10;AI-generated content may be incorrect."/>
-            <ns3:cNvGraphicFramePr>
+          <wp:inline wp14:editId="79474117" wp14:anchorId="6D483511">
+            <wp:extent cx="5734050" cy="2895600"/>
+            <wp:effectExtent l="0" t="0" r="0" b="0"/>
+            <wp:docPr id="1487176280" name="drawing" descr="A screenshot of a computer&#10;&#10;AI-generated content may be incorrect."/>
+            <wp:cNvGraphicFramePr>
               <ns5:graphicFrameLocks noChangeAspect="1"/>
-            </ns3:cNvGraphicFramePr>
+            </wp:cNvGraphicFramePr>
             <ns5:graphic>
               <ns5:graphicData uri="http://schemas.openxmlformats.org/drawingml/2006/picture">
                 <ns6:pic>
@@ -2218,11 +2218,11 @@
                 </ns6:pic>
               </ns5:graphicData>
             </ns5:graphic>
-          </ns3:inline>
+          </wp:inline>
         </w:drawing>
       </w:r>
     </w:p>
-    <w:p ns2:paraId="32A7C6AC" ns2:textId="31F35248">
+    <w:p>
       <w:pPr>
         <w:bidi w:val="0"/>
         <w:rPr>
@@ -2241,7 +2241,7 @@
         </w:rPr>
       </w:pPr>
     </w:p>
-    <w:p ns2:paraId="1627C23D" ns2:textId="0D16DC67">
+    <w:p>
       <w:pPr>
         <w:rPr>
           <w:rFonts w:ascii="Aptos" w:hAnsi="Aptos" w:eastAsia="Aptos" w:cs="Aptos"/>
@@ -2262,7 +2262,7 @@
         <w:t>Another example I looked at was CoinGecko. Its homepage presents a very large amount of market data, including headline statistics such as total market capitalisation across all currencies. Its coin listings include the current price, one-hour change, twenty-four-hour change, seven-day change, daily volume and a graph showing how the price moved over the previous week. I also noticed a range of filters, including highlights and category views, which helped me understand how a market-tracking platform can support both quick browsing and deeper analysis.</w:t>
       </w:r>
     </w:p>
-    <w:p ns2:paraId="5C025E16" ns2:textId="66E882C5">
+    <w:p>
       <w:pPr>
         <w:pStyle w:val="Heading2"/>
         <w:rPr>
@@ -2282,13 +2282,13 @@
       </w:pPr>
       <w:r>
         <w:drawing>
-          <ns3:inline ns4:editId="2DE2AAAA" ns4:anchorId="1BEEAB26">
-            <ns3:extent cx="5715000" cy="3105150"/>
-            <ns3:effectExtent l="0" t="0" r="0" b="0"/>
-            <ns3:docPr id="1949998281" name="drawing"/>
-            <ns3:cNvGraphicFramePr>
+          <wp:inline wp14:editId="2DE2AAAA" wp14:anchorId="1BEEAB26">
+            <wp:extent cx="5715000" cy="3105150"/>
+            <wp:effectExtent l="0" t="0" r="0" b="0"/>
+            <wp:docPr id="1949998281" name="drawing"/>
+            <wp:cNvGraphicFramePr>
               <ns5:graphicFrameLocks noChangeAspect="1"/>
-            </ns3:cNvGraphicFramePr>
+            </wp:cNvGraphicFramePr>
             <ns5:graphic>
               <ns5:graphicData uri="http://schemas.openxmlformats.org/drawingml/2006/picture">
                 <ns6:pic>
@@ -2320,11 +2320,11 @@
                 </ns6:pic>
               </ns5:graphicData>
             </ns5:graphic>
-          </ns3:inline>
+          </wp:inline>
         </w:drawing>
       </w:r>
     </w:p>
-    <w:p ns2:paraId="5364A701" ns2:textId="570EA58D">
+    <w:p>
       <w:pPr>
         <w:pStyle w:val="Heading2"/>
         <w:bidi w:val="0"/>
@@ -2353,7 +2353,7 @@
       </w:r>
       <w:bookmarkEnd w:id="812455102"/>
     </w:p>
-    <w:p ns2:paraId="05CCCFF9" ns2:textId="5B3E606F">
+    <w:p>
       <w:pPr>
         <w:bidi w:val="0"/>
         <w:rPr>
@@ -2375,19 +2375,19 @@
         <w:t>Although those sites are strong examples of crypto tracking, I noticed that prediction features are usually not their main focus. Because of that, I also looked at community-driven projects and smaller AI-focused platforms. These projects were often more cluttered, but they still gave me proof that price prediction interfaces were possible. One larger and more official-looking example I researched was Crypticorn, which presents crypto prices alongside possible future prices and a most-likely projection.</w:t>
       </w:r>
     </w:p>
-    <w:p ns2:paraId="4AC5DC9C" ns2:textId="56328A64">
+    <w:p>
       <w:pPr>
         <w:pStyle w:val="Normal"/>
       </w:pPr>
       <w:r>
         <w:drawing>
-          <ns3:inline ns4:editId="72D9D176" ns4:anchorId="7E54617F">
-            <ns3:extent cx="5943600" cy="3819525"/>
-            <ns3:effectExtent l="0" t="0" r="0" b="0"/>
-            <ns3:docPr id="1588482084" name="drawing"/>
-            <ns3:cNvGraphicFramePr>
+          <wp:inline wp14:editId="72D9D176" wp14:anchorId="7E54617F">
+            <wp:extent cx="5943600" cy="3819525"/>
+            <wp:effectExtent l="0" t="0" r="0" b="0"/>
+            <wp:docPr id="1588482084" name="drawing"/>
+            <wp:cNvGraphicFramePr>
               <ns5:graphicFrameLocks noChangeAspect="1"/>
-            </ns3:cNvGraphicFramePr>
+            </wp:cNvGraphicFramePr>
             <ns5:graphic>
               <ns5:graphicData uri="http://schemas.openxmlformats.org/drawingml/2006/picture">
                 <ns6:pic>
@@ -2419,11 +2419,11 @@
                 </ns6:pic>
               </ns5:graphicData>
             </ns5:graphic>
-          </ns3:inline>
+          </wp:inline>
         </w:drawing>
       </w:r>
     </w:p>
-    <w:p ns2:paraId="32F81C5E" ns2:textId="2FCA46FD">
+    <w:p>
       <w:pPr>
         <w:pStyle w:val="Normal"/>
       </w:pPr>
@@ -2431,7 +2431,7 @@
         <w:t>The Crypticorn dashboard also shows metrics beyond raw prices and predicted fluctuations, such as a market-trends meter linked to fear-and-greed style behaviour. I found that useful because it demonstrates how prediction can be combined with broader market context instead of being shown as an isolated number. The system appears to consider several factors, including technical indicators, macroeconomic news, on-chain data, search activity and chart patterns. That gave me a stronger idea of the types of features that a more advanced prediction tool can consider.</w:t>
       </w:r>
     </w:p>
-    <w:p ns2:paraId="7A1E6D61" ns2:textId="2A7A0C51">
+    <w:p>
       <w:pPr>
         <w:pStyle w:val="Normal"/>
         <w:bidi w:val="0"/>
@@ -2457,7 +2457,7 @@
         </w:r>
       </w:hyperlink>
     </w:p>
-    <w:p ns2:paraId="4EE57182" ns2:textId="249E0577">
+    <w:p>
       <w:pPr>
         <w:pStyle w:val="Normal"/>
         <w:bidi w:val="0"/>
@@ -2505,7 +2505,7 @@
         </w:r>
       </w:hyperlink>
     </w:p>
-    <w:p ns2:paraId="30670483" ns2:textId="3D3D1913">
+    <w:p>
       <w:pPr>
         <w:bidi w:val="0"/>
         <w:rPr>
@@ -2562,7 +2562,7 @@
         <w:t xml:space="preserve"> </w:t>
       </w:r>
     </w:p>
-    <w:p ns2:paraId="42654D52" ns2:textId="42CBEF7E">
+    <w:p>
       <w:pPr>
         <w:bidi w:val="0"/>
         <w:rPr>
@@ -2602,7 +2602,7 @@
         </w:r>
       </w:hyperlink>
     </w:p>
-    <w:p ns2:paraId="4713F106" ns2:textId="071EC1E3">
+    <w:p>
       <w:pPr>
         <w:bidi w:val="0"/>
         <w:rPr>
@@ -2642,7 +2642,7 @@
         </w:r>
       </w:hyperlink>
     </w:p>
-    <w:p ns2:paraId="412B6D25" ns2:textId="66847D6C">
+    <w:p>
       <w:pPr>
         <w:pStyle w:val="Heading1"/>
         <w:keepNext w:val="1"/>
@@ -2684,7 +2684,7 @@
       </w:r>
       <w:bookmarkEnd w:id="2100775501"/>
     </w:p>
-    <w:p ns2:paraId="0CEC1BC9" ns2:textId="0C5CEB1F">
+    <w:p>
       <w:pPr>
         <w:pStyle w:val="Heading2"/>
         <w:keepNext w:val="1"/>
@@ -2726,7 +2726,7 @@
       </w:r>
       <w:bookmarkEnd w:id="1152428995"/>
     </w:p>
-    <w:p ns2:paraId="65710938" ns2:textId="2913CCEF">
+    <w:p>
       <w:pPr>
         <w:bidi w:val="0"/>
         <w:rPr>
@@ -2748,7 +2748,7 @@
         <w:t>The websites I researched rely heavily on APIs, or Application Programming Interfaces, which are sets of rules that allow software components to communicate with one another. In simple terms, they let one piece of software request data or services from another. An API layer was clearly important for my own work as well, especially because the forecasting side of my project depends on reliable access to market data. One of the tools I expected to use most was `yfinance`, since it can gather data from Yahoo Finance after the official Yahoo Finance API was discontinued. That made my data-access layer much simpler to build than if I had needed to construct the whole request process manually.</w:t>
       </w:r>
     </w:p>
-    <w:p ns2:paraId="4FAE9615" ns2:textId="351D74EE">
+    <w:p>
       <w:pPr>
         <w:pStyle w:val="Heading2"/>
         <w:keepNext w:val="1"/>
@@ -2769,7 +2769,7 @@
       </w:r>
       <w:bookmarkEnd w:id="117270416"/>
     </w:p>
-    <w:p ns2:paraId="75FD2FE7" ns2:textId="04E6CAEC">
+    <w:p>
       <w:pPr>
         <w:pStyle w:val="Normal"/>
         <w:keepNext w:val="1"/>
@@ -2780,7 +2780,7 @@
         <w:t>`yfinance` is a popular open-source Python library that gives me free access to financial market data from Yahoo Finance, including cryptocurrency prices. It can download historical and near real-time OHLCV data for assets such as BTC-USD and ETH-USD without requiring API keys or paid subscriptions. I value it because it returns data as pandas DataFrames, supports intervals from one minute to monthly data, and integrates naturally with libraries such as scikit-learn, TensorFlow and PyTorch. In my project it acts as the foundational data layer for training, indicator creation, historical analysis and later forecasting runs.</w:t>
       </w:r>
     </w:p>
-    <w:p ns2:paraId="63FE36D1" ns2:textId="27415636">
+    <w:p>
       <w:pPr>
         <w:pStyle w:val="Heading2"/>
         <w:keepNext w:val="1"/>
@@ -2824,7 +2824,7 @@
       </w:r>
       <w:bookmarkEnd w:id="82403291"/>
     </w:p>
-    <w:p ns2:paraId="178C98CB" ns2:textId="2CF2B698">
+    <w:p>
       <w:pPr>
         <w:pStyle w:val="Normal"/>
         <w:keepNext w:val="1"/>
@@ -2839,7 +2839,7 @@
         <w:t>TensorFlow is an open-source machine-learning and artificial-intelligence library originally developed by Google's Brain team and released publicly in 2015. I researched it heavily because it offered an accessible way to build deep-learning models in Python while still relying on a high-performance backend in C++. Its Keras integration makes neural-network construction easier to understand, and the wider platform includes tools such as TensorBoard, LiteRT and TensorFlow Extended, which is why it is often treated as an end-to-end environment for the full machine-learning lifecycle.</w:t>
       </w:r>
     </w:p>
-    <w:p ns2:paraId="759BD2D6" ns2:textId="41162CB5">
+    <w:p>
       <w:pPr>
         <w:pStyle w:val="Normal"/>
         <w:keepNext w:val="1"/>
@@ -2854,7 +2854,7 @@
         <w:t>Even with TensorFlow's strengths, I understood that cryptocurrency prediction would still be difficult because markets are volatile and influenced by news, sentiment, macroeconomic events and trader behaviour. I also knew that hardware behaviour, randomness and GPU-specific execution could affect training consistency. That did not make TensorFlow useless; it simply meant that I had to treat predictions as probabilistic and experimental rather than as guaranteed answers. What still made TensorFlow valuable to me was its flexibility for testing stacked LSTMs, hybrid architectures, attention-style ideas and other modelling approaches early in the project.</w:t>
       </w:r>
     </w:p>
-    <w:p ns2:paraId="0BD63B4E" ns2:textId="3C9C4BF7">
+    <w:p>
       <w:pPr>
         <w:pStyle w:val="Heading2"/>
         <w:keepNext w:val="1"/>
@@ -2882,7 +2882,7 @@
         <w:t>Python Automation and Supporting Scripts</w:t>
       </w:r>
     </w:p>
-    <w:p ns2:paraId="6CEF13D7" ns2:textId="3E5E2D3C">
+    <w:p>
       <w:pPr>
         <w:bidi w:val="0"/>
         <w:rPr>
@@ -2904,7 +2904,7 @@
         <w:t>I also researched Python-based automation because my project benefits from being able to launch supporting scripts, move data through repeatable stages and reduce manual setup between runs. This became especially important once the project grew beyond a single training script and began to include preprocessing, plotting, artifact generation and launcher logic.</w:t>
       </w:r>
     </w:p>
-    <w:p ns2:paraId="5F0B949B" ns2:textId="66347763">
+    <w:p>
       <w:pPr>
         <w:bidi w:val="0"/>
         <w:rPr>
@@ -2926,7 +2926,7 @@
         <w:t>Using Python automation tools such as `subprocess` allowed me to think about how different parts of the system could be orchestrated cleanly. Rather than expecting every task to happen in one large file, I could separate responsibilities and still run them in a controlled order. That approach supports maintainability because each step can be tested, replaced or debugged without rewriting the entire application.</w:t>
       </w:r>
     </w:p>
-    <w:p ns2:paraId="70C079E6" ns2:textId="0D5EB198">
+    <w:p>
       <w:pPr>
         <w:bidi w:val="0"/>
         <w:rPr>
@@ -2948,7 +2948,7 @@
         <w:t>This automation-focused approach also improves efficiency and traceability. By running supporting scripts in a structured way, I can keep outputs consistent, reduce repeated manual mistakes and make the workflow easier to explain in coursework terms. It fits the wider goal of my project, which is not just to produce a prediction once, but to build a repeatable analytical pipeline.</w:t>
       </w:r>
     </w:p>
-    <w:p ns2:paraId="09E71D48" ns2:textId="6FF9236C">
+    <w:p>
       <w:pPr>
         <w:bidi w:val="0"/>
         <w:rPr>
@@ -2967,7 +2967,7 @@
         </w:rPr>
       </w:pPr>
     </w:p>
-    <w:p ns2:paraId="0CCD4B4B" ns2:textId="1E9F15F1">
+    <w:p>
       <w:pPr>
         <w:pStyle w:val="Heading1"/>
         <w:keepNext w:val="1"/>
@@ -3009,7 +3009,7 @@
       </w:r>
       <w:bookmarkEnd w:id="1472795613"/>
     </w:p>
-    <w:p ns2:paraId="1272B9E3" ns2:textId="32145319">
+    <w:p>
       <w:pPr>
         <w:bidi w:val="0"/>
         <w:rPr>
@@ -3031,7 +3031,7 @@
         <w:t>To make my project run properly in Python, I need several libraries for both compatibility and functionality. Each one supports a different part of the workflow, from storing data and handling tables to training models and displaying predictions.</w:t>
       </w:r>
     </w:p>
-    <w:p ns2:paraId="69736B7B" ns2:textId="2D5511C5">
+    <w:p>
       <w:pPr>
         <w:pStyle w:val="Heading2"/>
         <w:keepNext w:val="1"/>
@@ -3073,7 +3073,7 @@
       </w:r>
       <w:bookmarkEnd w:id="167732818"/>
     </w:p>
-    <w:p ns2:paraId="485827EC" ns2:textId="366D1294">
+    <w:p>
       <w:pPr>
         <w:bidi w:val="0"/>
         <w:rPr>
@@ -3095,7 +3095,7 @@
         <w:t>SQLite3 is a C library that gives me a lightweight disk-based database without needing a separate server process. I considered it useful because it is fast, responsive and widely deployed across websites, operating systems, mobile devices and embedded systems. Its history also supports its reputation for reliability. In my project, SQLite3 made sense both for the early account-based website concept and for any structured data I needed to preserve during development.</w:t>
       </w:r>
     </w:p>
-    <w:p ns2:paraId="0AEC7967" ns2:textId="1FA54587">
+    <w:p>
       <w:pPr>
         <w:bidi w:val="0"/>
         <w:rPr>
@@ -3117,7 +3117,7 @@
         <w:t>To open a connection to a database in Python, I would use the `sqlite3.connect` method with the appropriate database name.</w:t>
       </w:r>
     </w:p>
-    <w:p ns2:paraId="14623A3E" ns2:textId="4781CD05">
+    <w:p>
       <w:pPr>
         <w:bidi w:val="0"/>
         <w:rPr>
@@ -3137,13 +3137,13 @@
       </w:pPr>
       <w:r>
         <w:drawing>
-          <ns3:inline ns4:editId="2FB43A77" ns4:anchorId="41FCA9CF">
-            <ns3:extent cx="5943600" cy="542925"/>
-            <ns3:effectExtent l="0" t="0" r="0" b="0"/>
-            <ns3:docPr id="2094281457" name="drawing"/>
-            <ns3:cNvGraphicFramePr>
+          <wp:inline wp14:editId="2FB43A77" wp14:anchorId="41FCA9CF">
+            <wp:extent cx="5943600" cy="542925"/>
+            <wp:effectExtent l="0" t="0" r="0" b="0"/>
+            <wp:docPr id="2094281457" name="drawing"/>
+            <wp:cNvGraphicFramePr>
               <ns5:graphicFrameLocks noChangeAspect="1"/>
-            </ns3:cNvGraphicFramePr>
+            </wp:cNvGraphicFramePr>
             <ns5:graphic>
               <ns5:graphicData uri="http://schemas.openxmlformats.org/drawingml/2006/picture">
                 <ns6:pic>
@@ -3175,11 +3175,11 @@
                 </ns6:pic>
               </ns5:graphicData>
             </ns5:graphic>
-          </ns3:inline>
+          </wp:inline>
         </w:drawing>
       </w:r>
     </w:p>
-    <w:p ns2:paraId="1C6415C0" ns2:textId="31A8E751">
+    <w:p>
       <w:pPr>
         <w:bidi w:val="0"/>
         <w:ind w:left="0" w:hanging="0"/>
@@ -3202,7 +3202,7 @@
         <w:t>To run SQL statements after connecting, I would create a database cursor and use that cursor as the object that executes queries.</w:t>
       </w:r>
     </w:p>
-    <w:p ns2:paraId="0D28ACD8" ns2:textId="76BE8C35">
+    <w:p>
       <w:pPr>
         <w:bidi w:val="0"/>
         <w:rPr>
@@ -3222,13 +3222,13 @@
       </w:pPr>
       <w:r>
         <w:drawing>
-          <ns3:inline ns4:editId="52E434DA" ns4:anchorId="417FC658">
-            <ns3:extent cx="5915025" cy="333375"/>
-            <ns3:effectExtent l="0" t="0" r="0" b="0"/>
-            <ns3:docPr id="949255577" name="drawing"/>
-            <ns3:cNvGraphicFramePr>
+          <wp:inline wp14:editId="52E434DA" wp14:anchorId="417FC658">
+            <wp:extent cx="5915025" cy="333375"/>
+            <wp:effectExtent l="0" t="0" r="0" b="0"/>
+            <wp:docPr id="949255577" name="drawing"/>
+            <wp:cNvGraphicFramePr>
               <ns5:graphicFrameLocks noChangeAspect="1"/>
-            </ns3:cNvGraphicFramePr>
+            </wp:cNvGraphicFramePr>
             <ns5:graphic>
               <ns5:graphicData uri="http://schemas.openxmlformats.org/drawingml/2006/picture">
                 <ns6:pic>
@@ -3260,11 +3260,11 @@
                 </ns6:pic>
               </ns5:graphicData>
             </ns5:graphic>
-          </ns3:inline>
+          </wp:inline>
         </w:drawing>
       </w:r>
     </w:p>
-    <w:p ns2:paraId="4D887A2D" ns2:textId="77A6099A">
+    <w:p>
       <w:pPr>
         <w:bidi w:val="0"/>
         <w:rPr>
@@ -3286,7 +3286,7 @@
         <w:t>Once the cursor exists, I can interact with the database by calling the `execute` method with the SQL statement I want to run.</w:t>
       </w:r>
     </w:p>
-    <w:p ns2:paraId="1D119DE4" ns2:textId="3234F3B0">
+    <w:p>
       <w:pPr>
         <w:bidi w:val="0"/>
         <w:rPr>
@@ -3306,13 +3306,13 @@
       </w:pPr>
       <w:r>
         <w:drawing>
-          <ns3:inline ns4:editId="6A4AC17B" ns4:anchorId="5040B9F8">
-            <ns3:extent cx="5867400" cy="390525"/>
-            <ns3:effectExtent l="0" t="0" r="0" b="0"/>
-            <ns3:docPr id="2026222080" name="drawing"/>
-            <ns3:cNvGraphicFramePr>
+          <wp:inline wp14:editId="6A4AC17B" wp14:anchorId="5040B9F8">
+            <wp:extent cx="5867400" cy="390525"/>
+            <wp:effectExtent l="0" t="0" r="0" b="0"/>
+            <wp:docPr id="2026222080" name="drawing"/>
+            <wp:cNvGraphicFramePr>
               <ns5:graphicFrameLocks noChangeAspect="1"/>
-            </ns3:cNvGraphicFramePr>
+            </wp:cNvGraphicFramePr>
             <ns5:graphic>
               <ns5:graphicData uri="http://schemas.openxmlformats.org/drawingml/2006/picture">
                 <ns6:pic>
@@ -3344,11 +3344,11 @@
                 </ns6:pic>
               </ns5:graphicData>
             </ns5:graphic>
-          </ns3:inline>
+          </wp:inline>
         </w:drawing>
       </w:r>
     </w:p>
-    <w:p ns2:paraId="1FE5EE31" ns2:textId="07C3B891">
+    <w:p>
       <w:pPr>
         <w:bidi w:val="0"/>
         <w:rPr>
@@ -3370,7 +3370,7 @@
         <w:t>After making a change to the database, I would call `commit()` so the update is written to disk rather than staying only in memory.</w:t>
       </w:r>
     </w:p>
-    <w:p ns2:paraId="0C1833B6" ns2:textId="5B9C8756">
+    <w:p>
       <w:pPr>
         <w:bidi w:val="0"/>
         <w:rPr>
@@ -3390,13 +3390,13 @@
       </w:pPr>
       <w:r>
         <w:drawing>
-          <ns3:inline ns4:editId="05B03B30" ns4:anchorId="03E329A5">
-            <ns3:extent cx="5943600" cy="381000"/>
-            <ns3:effectExtent l="0" t="0" r="0" b="0"/>
-            <ns3:docPr id="144132293" name="drawing"/>
-            <ns3:cNvGraphicFramePr>
+          <wp:inline wp14:editId="05B03B30" wp14:anchorId="03E329A5">
+            <wp:extent cx="5943600" cy="381000"/>
+            <wp:effectExtent l="0" t="0" r="0" b="0"/>
+            <wp:docPr id="144132293" name="drawing"/>
+            <wp:cNvGraphicFramePr>
               <ns5:graphicFrameLocks noChangeAspect="1"/>
-            </ns3:cNvGraphicFramePr>
+            </wp:cNvGraphicFramePr>
             <ns5:graphic>
               <ns5:graphicData uri="http://schemas.openxmlformats.org/drawingml/2006/picture">
                 <ns6:pic>
@@ -3428,11 +3428,11 @@
                 </ns6:pic>
               </ns5:graphicData>
             </ns5:graphic>
-          </ns3:inline>
+          </wp:inline>
         </w:drawing>
       </w:r>
     </w:p>
-    <w:p ns2:paraId="3F331130" ns2:textId="40E4D788">
+    <w:p>
       <w:pPr>
         <w:bidi w:val="0"/>
         <w:rPr>
@@ -3454,7 +3454,7 @@
         <w:t>When I have finished all the required interactions, I can close the connection cleanly with `close()`.</w:t>
       </w:r>
     </w:p>
-    <w:p ns2:paraId="2F8C4FB3" ns2:textId="05E1D49D">
+    <w:p>
       <w:pPr>
         <w:bidi w:val="0"/>
         <w:rPr>
@@ -3474,13 +3474,13 @@
       </w:pPr>
       <w:r>
         <w:drawing>
-          <ns3:inline ns4:editId="24A89E08" ns4:anchorId="73BD98AB">
-            <ns3:extent cx="5943600" cy="342900"/>
-            <ns3:effectExtent l="0" t="0" r="0" b="0"/>
-            <ns3:docPr id="738064247" name="drawing"/>
-            <ns3:cNvGraphicFramePr>
+          <wp:inline wp14:editId="24A89E08" wp14:anchorId="73BD98AB">
+            <wp:extent cx="5943600" cy="342900"/>
+            <wp:effectExtent l="0" t="0" r="0" b="0"/>
+            <wp:docPr id="738064247" name="drawing"/>
+            <wp:cNvGraphicFramePr>
               <ns5:graphicFrameLocks noChangeAspect="1"/>
-            </ns3:cNvGraphicFramePr>
+            </wp:cNvGraphicFramePr>
             <ns5:graphic>
               <ns5:graphicData uri="http://schemas.openxmlformats.org/drawingml/2006/picture">
                 <ns6:pic>
@@ -3512,11 +3512,11 @@
                 </ns6:pic>
               </ns5:graphicData>
             </ns5:graphic>
-          </ns3:inline>
+          </wp:inline>
         </w:drawing>
       </w:r>
     </w:p>
-    <w:p ns2:paraId="1289C25F" ns2:textId="3D3C6E7B">
+    <w:p>
       <w:pPr>
         <w:bidi w:val="0"/>
         <w:rPr>
@@ -3538,7 +3538,7 @@
         <w:t>That final step matters because it helps ensure all changes have been written safely before Python ends the connection.</w:t>
       </w:r>
     </w:p>
-    <w:p ns2:paraId="448CF2C6" ns2:textId="24E58658">
+    <w:p>
       <w:pPr>
         <w:pStyle w:val="Normal"/>
         <w:bidi w:val="0"/>
@@ -3608,7 +3608,7 @@
         </w:r>
       </w:hyperlink>
     </w:p>
-    <w:p ns2:paraId="5D8D6A33" ns2:textId="1CA359F5">
+    <w:p>
       <w:pPr>
         <w:pStyle w:val="Heading2"/>
         <w:bidi w:val="0"/>
@@ -3637,7 +3637,7 @@
       </w:r>
       <w:bookmarkEnd w:id="2014732285"/>
     </w:p>
-    <w:p ns2:paraId="4BC11EC5" ns2:textId="2A285969">
+    <w:p>
       <w:pPr>
         <w:pStyle w:val="Normal"/>
         <w:bidi w:val="0"/>
@@ -3660,7 +3660,7 @@
         <w:t>Pandas is a Python library that I rely on for working with datasets. It can inspect, manipulate and display structured data, which is why it is widely treated as a core tool in data science.</w:t>
       </w:r>
     </w:p>
-    <w:p ns2:paraId="1CA2562F" ns2:textId="56BE9EA9">
+    <w:p>
       <w:pPr>
         <w:pStyle w:val="Normal"/>
         <w:bidi w:val="0"/>
@@ -3683,7 +3683,7 @@
         <w:t>I need pandas because it works alongside many other analytical and forecasting libraries, and because it helps me clean data and produce more reliable inputs for the prediction pipeline.</w:t>
       </w:r>
     </w:p>
-    <w:p ns2:paraId="30486758" ns2:textId="5BD39533">
+    <w:p>
       <w:pPr>
         <w:pStyle w:val="Normal"/>
         <w:bidi w:val="0"/>
@@ -3706,19 +3706,19 @@
         <w:t>Pandas was designed mainly for tabular data, which fits my project well because much of the data I process behaves like spreadsheets or CSV-style tables. That makes it ideal for reading, writing and transforming the financial datasets used by my algorithm.</w:t>
       </w:r>
     </w:p>
-    <w:p ns2:paraId="056230AB" ns2:textId="432E4907">
+    <w:p>
       <w:pPr>
         <w:pStyle w:val="Normal"/>
       </w:pPr>
       <w:r>
         <w:drawing>
-          <ns3:inline ns4:editId="4E6C77BF" ns4:anchorId="7B41C6BA">
-            <ns3:extent cx="5134692" cy="3743847"/>
-            <ns3:effectExtent l="0" t="0" r="0" b="0"/>
-            <ns3:docPr id="21705584" name="drawing"/>
-            <ns3:cNvGraphicFramePr>
+          <wp:inline wp14:editId="4E6C77BF" wp14:anchorId="7B41C6BA">
+            <wp:extent cx="5134692" cy="3743847"/>
+            <wp:effectExtent l="0" t="0" r="0" b="0"/>
+            <wp:docPr id="21705584" name="drawing"/>
+            <wp:cNvGraphicFramePr>
               <ns5:graphicFrameLocks noChangeAspect="1"/>
-            </ns3:cNvGraphicFramePr>
+            </wp:cNvGraphicFramePr>
             <ns5:graphic>
               <ns5:graphicData uri="http://schemas.openxmlformats.org/drawingml/2006/picture">
                 <ns6:pic>
@@ -3750,11 +3750,11 @@
                 </ns6:pic>
               </ns5:graphicData>
             </ns5:graphic>
-          </ns3:inline>
+          </wp:inline>
         </w:drawing>
       </w:r>
     </w:p>
-    <w:p ns2:paraId="1FD4FCDF" ns2:textId="4EFFA42E">
+    <w:p>
       <w:pPr>
         <w:pStyle w:val="Heading2"/>
         <w:bidi w:val="0"/>
@@ -3783,7 +3783,7 @@
       </w:r>
       <w:bookmarkEnd w:id="80933570"/>
     </w:p>
-    <w:p ns2:paraId="0E37E759" ns2:textId="6C74E34E">
+    <w:p>
       <w:pPr>
         <w:pStyle w:val="Normal"/>
         <w:bidi w:val="0"/>
@@ -3796,7 +3796,7 @@
         <w:t>NumPy is a fundamental package for scientific computing and numerical data handling. I use it because it gives me efficient array operations, indexing and vectorisation, all of which matter once financial data has to be reshaped into model-ready inputs. Since much of the library is implemented in C and C++, it also supports the speed and efficiency I need for repeated forecasting experiments.</w:t>
       </w:r>
     </w:p>
-    <w:p ns2:paraId="483088A9" ns2:textId="2370F8EF">
+    <w:p>
       <w:pPr>
         <w:pStyle w:val="Heading2"/>
         <w:bidi w:val="0"/>
@@ -3815,7 +3815,7 @@
       </w:r>
       <w:bookmarkEnd w:id="1848200652"/>
     </w:p>
-    <w:p ns2:paraId="29565244" ns2:textId="1F81CFB2">
+    <w:p>
       <w:pPr>
         <w:pStyle w:val="Normal"/>
         <w:bidi w:val="0"/>
@@ -3828,7 +3828,7 @@
         <w:t>Matplotlib is my main Python graphing tool for visualising statistics in different formats. I use it to present LSTM results through line graphs and other plots so the model output can be interpreted visually rather than only through raw numbers.</w:t>
       </w:r>
     </w:p>
-    <w:p ns2:paraId="7B4E45C3" ns2:textId="5F0D3746">
+    <w:p>
       <w:pPr>
         <w:pStyle w:val="Normal"/>
         <w:bidi w:val="0"/>
@@ -3838,7 +3838,7 @@
         </w:rPr>
       </w:pPr>
     </w:p>
-    <w:p ns2:paraId="4DEF084D" ns2:textId="1120C835">
+    <w:p>
       <w:pPr>
         <w:pStyle w:val="Heading2"/>
         <w:bidi w:val="0"/>
@@ -3857,7 +3857,7 @@
       </w:r>
       <w:bookmarkEnd w:id="311448486"/>
     </w:p>
-    <w:p ns2:paraId="71CEB482" ns2:textId="74C9C4EE">
+    <w:p>
       <w:pPr>
         <w:bidi w:val="0"/>
         <w:spacing w:before="0" w:beforeAutospacing="off" w:after="240" w:afterAutospacing="off"/>
@@ -3866,7 +3866,7 @@
         <w:t>Pickle is a serialization and deserialization library that I considered for preserving data, figures and model-related state between runs. In practice, that means it can help me save a trained model, store a Matplotlib figure for later extraction or keep prediction results available without rebuilding them from scratch. It is useful in controlled internal workflows, although I also recognise that it is unsafe for untrusted data because unpickling can execute malicious Python callables.</w:t>
       </w:r>
     </w:p>
-    <w:p ns2:paraId="4E22FC1B" ns2:textId="61574A2E">
+    <w:p>
       <w:pPr>
         <w:pStyle w:val="Normal"/>
         <w:bidi w:val="0"/>
@@ -3876,19 +3876,19 @@
         </w:rPr>
       </w:pPr>
     </w:p>
-    <w:p ns2:paraId="5D658792" ns2:textId="37728B75">
+    <w:p>
       <w:pPr>
         <w:pStyle w:val="Normal"/>
       </w:pPr>
       <w:r>
         <w:drawing>
-          <ns3:inline ns4:editId="47C19D51" ns4:anchorId="047A0848">
-            <ns3:extent cx="5943600" cy="1466850"/>
-            <ns3:effectExtent l="0" t="0" r="0" b="0"/>
-            <ns3:docPr id="1855612906" name="drawing"/>
-            <ns3:cNvGraphicFramePr>
+          <wp:inline wp14:editId="47C19D51" wp14:anchorId="047A0848">
+            <wp:extent cx="5943600" cy="1466850"/>
+            <wp:effectExtent l="0" t="0" r="0" b="0"/>
+            <wp:docPr id="1855612906" name="drawing"/>
+            <wp:cNvGraphicFramePr>
               <ns5:graphicFrameLocks noChangeAspect="1"/>
-            </ns3:cNvGraphicFramePr>
+            </wp:cNvGraphicFramePr>
             <ns5:graphic>
               <ns5:graphicData uri="http://schemas.openxmlformats.org/drawingml/2006/picture">
                 <ns6:pic>
@@ -3920,18 +3920,18 @@
                 </ns6:pic>
               </ns5:graphicData>
             </ns5:graphic>
-          </ns3:inline>
+          </wp:inline>
         </w:drawing>
       </w:r>
       <w:r>
         <w:drawing>
-          <ns3:inline ns4:editId="2597C565" ns4:anchorId="3B21BB05">
-            <ns3:extent cx="2381250" cy="5943600"/>
-            <ns3:effectExtent l="0" t="0" r="0" b="0"/>
-            <ns3:docPr id="717836202" name="drawing"/>
-            <ns3:cNvGraphicFramePr>
+          <wp:inline wp14:editId="2597C565" wp14:anchorId="3B21BB05">
+            <wp:extent cx="2381250" cy="5943600"/>
+            <wp:effectExtent l="0" t="0" r="0" b="0"/>
+            <wp:docPr id="717836202" name="drawing"/>
+            <wp:cNvGraphicFramePr>
               <ns5:graphicFrameLocks noChangeAspect="1"/>
-            </ns3:cNvGraphicFramePr>
+            </wp:cNvGraphicFramePr>
             <ns5:graphic>
               <ns5:graphicData uri="http://schemas.openxmlformats.org/drawingml/2006/picture">
                 <ns6:pic>
@@ -3963,11 +3963,11 @@
                 </ns6:pic>
               </ns5:graphicData>
             </ns5:graphic>
-          </ns3:inline>
+          </wp:inline>
         </w:drawing>
       </w:r>
     </w:p>
-    <w:p ns2:paraId="23A46E6C" ns2:textId="69E4CDD3">
+    <w:p>
       <w:pPr>
         <w:pStyle w:val="Heading2"/>
         <w:bidi w:val="0"/>
@@ -3979,7 +3979,7 @@
       </w:r>
       <w:bookmarkEnd w:id="2011343552"/>
     </w:p>
-    <w:p ns2:paraId="474F4765" ns2:textId="505D360C">
+    <w:p>
       <w:pPr>
         <w:pStyle w:val="Normal"/>
       </w:pPr>
@@ -3987,19 +3987,19 @@
         <w:t>TensorFlow is a machine-learning library developed by Google and closely tied to the Keras framework. I explored it because it let me build neural networks with a relatively approachable high-level interface while still benefiting from strong hardware acceleration and automatic differentiation underneath. That made it a sensible starting point for my early LSTM work.</w:t>
       </w:r>
     </w:p>
-    <w:p ns2:paraId="1753A7F5" ns2:textId="4259DBE9">
+    <w:p>
       <w:pPr>
         <w:pStyle w:val="Normal"/>
       </w:pPr>
       <w:r>
         <w:drawing>
-          <ns3:inline ns4:editId="5E71C6BB" ns4:anchorId="7C17DE25">
-            <ns3:extent cx="5943600" cy="4143375"/>
-            <ns3:effectExtent l="0" t="0" r="0" b="0"/>
-            <ns3:docPr id="2059415364" name="drawing"/>
-            <ns3:cNvGraphicFramePr>
+          <wp:inline wp14:editId="5E71C6BB" wp14:anchorId="7C17DE25">
+            <wp:extent cx="5943600" cy="4143375"/>
+            <wp:effectExtent l="0" t="0" r="0" b="0"/>
+            <wp:docPr id="2059415364" name="drawing"/>
+            <wp:cNvGraphicFramePr>
               <ns5:graphicFrameLocks noChangeAspect="1"/>
-            </ns3:cNvGraphicFramePr>
+            </wp:cNvGraphicFramePr>
             <ns5:graphic>
               <ns5:graphicData uri="http://schemas.openxmlformats.org/drawingml/2006/picture">
                 <ns6:pic>
@@ -4031,23 +4031,23 @@
                 </ns6:pic>
               </ns5:graphicData>
             </ns5:graphic>
-          </ns3:inline>
+          </wp:inline>
         </w:drawing>
       </w:r>
     </w:p>
-    <w:p ns2:paraId="6147830D" ns2:textId="53F9A7A6">
+    <w:p>
       <w:pPr>
         <w:pStyle w:val="Normal"/>
       </w:pPr>
       <w:r>
         <w:drawing>
-          <ns3:inline ns4:editId="5F2A9322" ns4:anchorId="668B6B5D">
-            <ns3:extent cx="5943600" cy="2609850"/>
-            <ns3:effectExtent l="0" t="0" r="0" b="0"/>
-            <ns3:docPr id="214801474" name="drawing"/>
-            <ns3:cNvGraphicFramePr>
+          <wp:inline wp14:editId="5F2A9322" wp14:anchorId="668B6B5D">
+            <wp:extent cx="5943600" cy="2609850"/>
+            <wp:effectExtent l="0" t="0" r="0" b="0"/>
+            <wp:docPr id="214801474" name="drawing"/>
+            <wp:cNvGraphicFramePr>
               <ns5:graphicFrameLocks noChangeAspect="1"/>
-            </ns3:cNvGraphicFramePr>
+            </wp:cNvGraphicFramePr>
             <ns5:graphic>
               <ns5:graphicData uri="http://schemas.openxmlformats.org/drawingml/2006/picture">
                 <ns6:pic>
@@ -4079,11 +4079,11 @@
                 </ns6:pic>
               </ns5:graphicData>
             </ns5:graphic>
-          </ns3:inline>
+          </wp:inline>
         </w:drawing>
       </w:r>
     </w:p>
-    <w:p ns2:paraId="7D1CFC41" ns2:textId="78572AB2">
+    <w:p>
       <w:pPr>
         <w:pStyle w:val="Heading2"/>
       </w:pPr>
@@ -4098,7 +4098,7 @@
       </w:r>
       <w:bookmarkEnd w:id="725340670"/>
     </w:p>
-    <w:p ns2:paraId="67FC78A5" ns2:textId="615689AA">
+    <w:p>
       <w:pPr>
         <w:pStyle w:val="Normal"/>
       </w:pPr>
@@ -4106,19 +4106,19 @@
         <w:t>PyTorch is a deep-learning library built largely in C++ and widely treated as a serious rival to TensorFlow. I ended up valuing it because it gave me clearer control over device behaviour, a more direct Pythonic coding style and stronger practical compatibility with the hardware path I was testing. I also found its separation into `torch`, `torch.nn` and `torch.optim` useful, because that made the flow between tensor handling, network construction and optimisation easier for me to reason about.</w:t>
       </w:r>
     </w:p>
-    <w:p ns2:paraId="513139CA" ns2:textId="56AF5D24">
+    <w:p>
       <w:pPr>
         <w:pStyle w:val="Normal"/>
       </w:pPr>
       <w:r>
         <w:drawing>
-          <ns3:inline ns4:editId="50B8D383" ns4:anchorId="229C9A17">
-            <ns3:extent cx="5943600" cy="4114800"/>
-            <ns3:effectExtent l="0" t="0" r="0" b="0"/>
-            <ns3:docPr id="353380259" name="drawing"/>
-            <ns3:cNvGraphicFramePr>
+          <wp:inline wp14:editId="50B8D383" wp14:anchorId="229C9A17">
+            <wp:extent cx="5943600" cy="4114800"/>
+            <wp:effectExtent l="0" t="0" r="0" b="0"/>
+            <wp:docPr id="353380259" name="drawing"/>
+            <wp:cNvGraphicFramePr>
               <ns5:graphicFrameLocks noChangeAspect="1"/>
-            </ns3:cNvGraphicFramePr>
+            </wp:cNvGraphicFramePr>
             <ns5:graphic>
               <ns5:graphicData uri="http://schemas.openxmlformats.org/drawingml/2006/picture">
                 <ns6:pic>
@@ -4150,11 +4150,11 @@
                 </ns6:pic>
               </ns5:graphicData>
             </ns5:graphic>
-          </ns3:inline>
+          </wp:inline>
         </w:drawing>
       </w:r>
     </w:p>
-    <w:p ns2:paraId="6EB9AB4B" ns2:textId="67D78411">
+    <w:p>
       <w:pPr>
         <w:pStyle w:val="Heading2"/>
       </w:pPr>
@@ -4167,7 +4167,7 @@
         <w:t>Optimiser</w:t>
       </w:r>
     </w:p>
-    <w:p ns2:paraId="471FC440" ns2:textId="2193253F">
+    <w:p>
       <w:pPr>
         <w:pStyle w:val="Normal"/>
       </w:pPr>
@@ -4175,12 +4175,12 @@
         <w:t>`torch_optimizer` is a drop-in extension for PyTorch's native optimiser module, and I researched it because it expands the set of training strategies I can test without rewriting the rest of my model code. It includes a large collection of research-oriented optimisers such as DiffGrad, AdaBelief, AdaBound and Ranger, each of which approaches convergence and training stability in a different way. What mattered most to me was that these optimisers could be swapped into an otherwise standard PyTorch workflow with very little structural change.</w:t>
       </w:r>
     </w:p>
-    <w:p ns2:paraId="0793FF81" ns2:textId="473909F8">
+    <w:p>
       <w:pPr>
         <w:pStyle w:val="Normal"/>
       </w:pPr>
     </w:p>
-    <w:p ns2:paraId="329A3AC2" ns2:textId="2D615F4C">
+    <w:p>
       <w:pPr>
         <w:pStyle w:val="Normal"/>
       </w:pPr>
@@ -4206,13 +4206,13 @@
       </w:r>
       <w:r>
         <w:drawing>
-          <ns3:inline ns4:editId="2CCE4067" ns4:anchorId="1CA66ECF">
-            <ns3:extent cx="5943600" cy="4657725"/>
-            <ns3:effectExtent l="0" t="0" r="0" b="0"/>
-            <ns3:docPr id="2056290524" name="drawing"/>
-            <ns3:cNvGraphicFramePr>
+          <wp:inline wp14:editId="2CCE4067" wp14:anchorId="1CA66ECF">
+            <wp:extent cx="5943600" cy="4657725"/>
+            <wp:effectExtent l="0" t="0" r="0" b="0"/>
+            <wp:docPr id="2056290524" name="drawing"/>
+            <wp:cNvGraphicFramePr>
               <ns5:graphicFrameLocks noChangeAspect="1"/>
-            </ns3:cNvGraphicFramePr>
+            </wp:cNvGraphicFramePr>
             <ns5:graphic>
               <ns5:graphicData uri="http://schemas.openxmlformats.org/drawingml/2006/picture">
                 <ns6:pic>
@@ -4244,11 +4244,11 @@
                 </ns6:pic>
               </ns5:graphicData>
             </ns5:graphic>
-          </ns3:inline>
+          </wp:inline>
         </w:drawing>
       </w:r>
     </w:p>
-    <w:p ns2:paraId="3B09DE7A" ns2:textId="47DE262A">
+    <w:p>
       <w:pPr>
         <w:pStyle w:val="Heading2"/>
         <w:bidi w:val="0"/>
@@ -4267,7 +4267,7 @@
       </w:r>
       <w:bookmarkEnd w:id="1941582020"/>
     </w:p>
-    <w:p ns2:paraId="4E248CA8" ns2:textId="1EF625AB">
+    <w:p>
       <w:pPr>
         <w:pStyle w:val="Normal"/>
         <w:suppressLineNumbers w:val="0"/>
@@ -4294,7 +4294,7 @@
         <w:t>One issue I identified was the server laptop that I originally expected to host the data and run the prediction process. The Linux Mint version on that machine did not properly support the Python environment I needed for TensorFlow, which created compilation problems and prevented the algorithm from running to completion. That forced me to think about fallback plans instead of assuming the original environment would work perfectly.</w:t>
       </w:r>
     </w:p>
-    <w:p ns2:paraId="2D4B4983" ns2:textId="5980956B">
+    <w:p>
       <w:pPr>
         <w:pStyle w:val="Normal"/>
         <w:suppressLineNumbers w:val="0"/>
@@ -4321,7 +4321,7 @@
         <w:t>One possible fallback would have been to run the prediction algorithm on a client's device, but I considered that both unreliable and ethically poor, so I treated it only as a last resort. A much more realistic option was to generate the predictions on my home device and then transfer the resulting data to the Linux server for hosting.</w:t>
       </w:r>
     </w:p>
-    <w:p ns2:paraId="681649C0" ns2:textId="67387DB8">
+    <w:p>
       <w:pPr>
         <w:pStyle w:val="Normal"/>
         <w:suppressLineNumbers w:val="0"/>
@@ -4348,7 +4348,7 @@
         <w:t>My home computer is much more capable of running AI workloads, especially on the GPU. I planned to use my AMD 9070 XT with 16GB of VRAM rather than relying only on the CPU, an AMD Ryzen 5 9600X with 6 cores and 12 threads. I also looked at WSL2 because my preferred AI stack did not fully support the exact GPU path I wanted under native Windows. That introduced extra complexity, but it gave me a practical route toward making the stronger hardware available to the project.</w:t>
       </w:r>
     </w:p>
-    <w:p ns2:paraId="47B3D123" ns2:textId="1B9C401A">
+    <w:p>
       <w:pPr>
         <w:pStyle w:val="Normal"/>
         <w:suppressLineNumbers w:val="0"/>
@@ -4375,7 +4375,7 @@
         <w:t>I understood that this approach also introduced risk. Because the setup was not fully native, I could run into compatibility issues, missing packages or long periods of troubleshooting. Even so, I saw it as a worthwhile trade-off if it meant avoiding a larger operating-system change while still getting the model running on the hardware I already owned.</w:t>
       </w:r>
     </w:p>
-    <w:p ns2:paraId="2D29C576" ns2:textId="2993BEB7">
+    <w:p>
       <w:pPr>
         <w:pStyle w:val="Normal"/>
         <w:suppressLineNumbers w:val="0"/>
@@ -4402,7 +4402,7 @@
         <w:t>My plan was to try the Hypervisor route first through a Windows batch installer, then move to a fuller Windows installation upgrade if software compatibility made the first option too unstable or too slow.</w:t>
       </w:r>
     </w:p>
-    <w:p ns2:paraId="68C011FB" ns2:textId="5FE1A2F5">
+    <w:p>
       <w:pPr>
         <w:pStyle w:val="Normal"/>
         <w:suppressLineNumbers w:val="0"/>
@@ -4429,7 +4429,7 @@
         <w:t>If major complications arose, I was prepared to consider unofficial tools for switching Windows versions, although I preferred to avoid them because of the risks and controversy attached to that route.</w:t>
       </w:r>
     </w:p>
-    <w:p ns2:paraId="66CE5E8B" ns2:textId="066E9417">
+    <w:p>
       <w:pPr>
         <w:pStyle w:val="Normal"/>
         <w:bidi w:val="0"/>
@@ -4439,7 +4439,7 @@
         </w:rPr>
       </w:pPr>
     </w:p>
-    <w:p ns2:paraId="22BCF2C2" ns2:textId="41A9C3F9">
+    <w:p>
       <w:pPr>
         <w:pStyle w:val="Heading1"/>
         <w:rPr>
@@ -4457,7 +4457,7 @@
       </w:r>
       <w:bookmarkEnd w:id="652198947"/>
     </w:p>
-    <w:p ns2:paraId="251F97FF" ns2:textId="1650FD5B">
+    <w:p>
       <w:pPr>
         <w:pStyle w:val="Normal"/>
         <w:bidi w:val="0"/>
@@ -4467,20 +4467,20 @@
         </w:rPr>
       </w:pPr>
     </w:p>
-    <w:p ns2:paraId="1BA8AAC9" ns2:textId="72B1ADDB">
+    <w:p>
       <w:pPr>
         <w:pStyle w:val="Normal"/>
         <w:bidi w:val="0"/>
       </w:pPr>
       <w:r>
         <w:drawing>
-          <ns3:inline ns4:editId="43FA6434" ns4:anchorId="1AA69AA8">
-            <ns3:extent cx="6125574" cy="2738838"/>
-            <ns3:effectExtent l="0" t="0" r="0" b="0"/>
-            <ns3:docPr id="336357077" name="drawing"/>
-            <ns3:cNvGraphicFramePr>
+          <wp:inline wp14:editId="43FA6434" wp14:anchorId="1AA69AA8">
+            <wp:extent cx="6125574" cy="2738838"/>
+            <wp:effectExtent l="0" t="0" r="0" b="0"/>
+            <wp:docPr id="336357077" name="drawing"/>
+            <wp:cNvGraphicFramePr>
               <ns5:graphicFrameLocks noChangeAspect="1"/>
-            </ns3:cNvGraphicFramePr>
+            </wp:cNvGraphicFramePr>
             <ns5:graphic>
               <ns5:graphicData uri="http://schemas.openxmlformats.org/drawingml/2006/picture">
                 <ns6:pic>
@@ -4512,11 +4512,11 @@
                 </ns6:pic>
               </ns5:graphicData>
             </ns5:graphic>
-          </ns3:inline>
+          </wp:inline>
         </w:drawing>
       </w:r>
     </w:p>
-    <w:p ns2:paraId="5C506020" ns2:textId="040FA766">
+    <w:p>
       <w:pPr>
         <w:pStyle w:val="Heading1"/>
         <w:bidi w:val="0"/>
@@ -4528,20 +4528,20 @@
       </w:r>
       <w:bookmarkEnd w:id="1577452119"/>
     </w:p>
-    <w:p ns2:paraId="054B5594" ns2:textId="6706E59F">
+    <w:p>
       <w:pPr>
         <w:pStyle w:val="Normal"/>
         <w:bidi w:val="0"/>
       </w:pPr>
       <w:r>
         <w:drawing>
-          <ns3:inline ns4:editId="6A711D6A" ns4:anchorId="0D752872">
-            <ns3:extent cx="5943600" cy="3686175"/>
-            <ns3:effectExtent l="0" t="0" r="0" b="0"/>
-            <ns3:docPr id="1001474635" name="drawing"/>
-            <ns3:cNvGraphicFramePr>
+          <wp:inline wp14:editId="6A711D6A" wp14:anchorId="0D752872">
+            <wp:extent cx="5943600" cy="3686175"/>
+            <wp:effectExtent l="0" t="0" r="0" b="0"/>
+            <wp:docPr id="1001474635" name="drawing"/>
+            <wp:cNvGraphicFramePr>
               <ns5:graphicFrameLocks noChangeAspect="1"/>
-            </ns3:cNvGraphicFramePr>
+            </wp:cNvGraphicFramePr>
             <ns5:graphic>
               <ns5:graphicData uri="http://schemas.openxmlformats.org/drawingml/2006/picture">
                 <ns6:pic>
@@ -4573,11 +4573,11 @@
                 </ns6:pic>
               </ns5:graphicData>
             </ns5:graphic>
-          </ns3:inline>
+          </wp:inline>
         </w:drawing>
       </w:r>
     </w:p>
-    <w:p ns2:paraId="4FBF2610" ns2:textId="20503239">
+    <w:p>
       <w:pPr>
         <w:bidi w:val="0"/>
         <w:rPr>
@@ -4596,7 +4596,7 @@
         </w:rPr>
       </w:pPr>
     </w:p>
-    <w:p ns2:paraId="7ACA83DE" ns2:textId="193E0306">
+    <w:p>
       <w:pPr>
         <w:bidi w:val="0"/>
         <w:rPr>
@@ -4615,7 +4615,7 @@
         </w:rPr>
       </w:pPr>
     </w:p>
-    <w:p ns2:paraId="6A8484C7" ns2:textId="0CD9070E">
+    <w:p>
       <w:pPr>
         <w:bidi w:val="0"/>
         <w:rPr>
@@ -4634,7 +4634,7 @@
         </w:rPr>
       </w:pPr>
     </w:p>
-    <w:p ns2:paraId="5E7ECF8E" ns2:textId="1C777F6D">
+    <w:p>
       <w:pPr>
         <w:bidi w:val="0"/>
         <w:rPr>
@@ -4653,7 +4653,7 @@
         </w:rPr>
       </w:pPr>
     </w:p>
-    <w:p ns2:paraId="13E233D9" ns2:textId="03E2CCB4">
+    <w:p>
       <w:pPr>
         <w:bidi w:val="0"/>
         <w:rPr>
@@ -4672,7 +4672,7 @@
         </w:rPr>
       </w:pPr>
     </w:p>
-    <w:p ns2:paraId="5C57803B" ns2:textId="0965FA2E">
+    <w:p>
       <w:pPr>
         <w:bidi w:val="0"/>
         <w:rPr>
@@ -4710,7 +4710,7 @@
         </w:r>
       </w:hyperlink>
     </w:p>
-    <w:p ns2:paraId="4F3F7835" ns2:textId="5F01C85D">
+    <w:p>
       <w:pPr>
         <w:bidi w:val="0"/>
         <w:rPr>
@@ -4746,7 +4746,7 @@
         <w:t>READING EXCEL DOCUMENTS USING PYTHON</w:t>
       </w:r>
     </w:p>
-    <w:p ns2:paraId="10800A90" ns2:textId="1FFCDD41">
+    <w:p>
       <w:pPr>
         <w:bidi w:val="0"/>
         <w:rPr>
@@ -4765,7 +4765,7 @@
         </w:rPr>
       </w:pPr>
     </w:p>
-    <w:p ns2:paraId="6AEB3F14" ns2:textId="351D2FAE">
+    <w:p>
       <w:pPr>
         <w:bidi w:val="0"/>
         <w:rPr>
@@ -4784,7 +4784,7 @@
         </w:rPr>
       </w:pPr>
     </w:p>
-    <w:p ns2:paraId="2F4BC258" ns2:textId="165F9052">
+    <w:p>
       <w:pPr>
         <w:bidi w:val="0"/>
         <w:rPr>
@@ -4824,7 +4824,7 @@
         </w:r>
       </w:hyperlink>
     </w:p>
-    <w:p ns2:paraId="41D7124E" ns2:textId="284D3FFB">
+    <w:p>
       <w:pPr>
         <w:bidi w:val="0"/>
         <w:rPr>
@@ -4846,7 +4846,7 @@
         <w:t>https://pytorch-optimizers.readthedocs.io/en/latest/</w:t>
       </w:r>
     </w:p>
-    <w:p ns2:paraId="0DB1861D" ns2:textId="63953120">
+    <w:p>
       <w:pPr>
         <w:bidi w:val="0"/>
         <w:rPr>
@@ -4865,7 +4865,7 @@
         </w:rPr>
       </w:pPr>
     </w:p>
-    <w:p ns2:paraId="4E4A5D21" ns2:textId="4A85696B">
+    <w:p>
       <w:pPr>
         <w:pStyle w:val="Normal"/>
         <w:bidi w:val="0"/>
@@ -4930,7 +4930,7 @@
         </w:r>
       </w:hyperlink>
     </w:p>
-    <w:p ns2:paraId="0F215041" ns2:textId="7E67FAF3">
+    <w:p>
       <w:pPr>
         <w:pStyle w:val="Normal"/>
         <w:bidi w:val="0"/>
@@ -4978,7 +4978,7 @@
         </w:r>
       </w:hyperlink>
     </w:p>
-    <w:p ns2:paraId="20F70A76" ns2:textId="5D9059B6">
+    <w:p>
       <w:pPr>
         <w:pStyle w:val="Normal"/>
         <w:bidi w:val="0"/>
@@ -5026,7 +5026,7 @@
         </w:r>
       </w:hyperlink>
     </w:p>
-    <w:p ns2:paraId="1F0962ED" ns2:textId="57F12D1E">
+    <w:p>
       <w:pPr>
         <w:pStyle w:val="Normal"/>
         <w:bidi w:val="0"/>
@@ -5039,7 +5039,7 @@
         </w:rPr>
       </w:pPr>
     </w:p>
-    <w:p ns2:paraId="30BF5205" ns2:textId="51C9D1EE">
+    <w:p>
       <w:pPr>
         <w:pStyle w:val="Heading1"/>
         <w:keepNext w:val="1"/>
@@ -5082,7 +5082,7 @@
       </w:r>
       <w:bookmarkEnd w:id="715989211"/>
     </w:p>
-    <w:p ns2:paraId="2367EC16" ns2:textId="3210489C">
+    <w:p>
       <w:pPr>
         <w:bidi w:val="0"/>
         <w:spacing w:after="240" w:line="360" w:lineRule="auto"/>
@@ -5105,7 +5105,7 @@
         <w:t>Smith, E. (2025). Setting up Your API Key. [online] CoinGecko API Documentation. Available at: https://docs.coingecko.com/reference/setting-up-your-api-key [Accessed 5 Jun. 2025].</w:t>
       </w:r>
     </w:p>
-    <w:p ns2:paraId="188EA310" ns2:textId="2C56C4EA">
+    <w:p>
       <w:pPr>
         <w:bidi w:val="0"/>
         <w:spacing w:before="240" w:after="240" w:line="360" w:lineRule="auto"/>
@@ -5128,7 +5128,7 @@
         <w:t>sqlite3 - DB-API 2.0 interface for SQLite databases (no date) Python documentation. Available at: https://docs.python.org/3/library/sqlite3.html (Accessed: June 13, 2025).</w:t>
       </w:r>
     </w:p>
-    <w:p ns2:paraId="00AD7300" ns2:textId="6D386DC9">
+    <w:p>
       <w:pPr>
         <w:bidi w:val="0"/>
         <w:spacing w:before="240" w:after="240" w:line="360" w:lineRule="auto"/>
@@ -5151,7 +5151,7 @@
         <w:t>Requests (no date) PyPI. Available at: https://pypi.org/project/requests/ (Accessed: June 13, 2025).</w:t>
       </w:r>
     </w:p>
-    <w:p ns2:paraId="3A8C9AAC" ns2:textId="63C5E653">
+    <w:p>
       <w:pPr>
         <w:bidi w:val="0"/>
         <w:spacing w:before="240" w:after="240" w:line="360" w:lineRule="auto"/>
@@ -5174,7 +5174,7 @@
         <w:t>Quickstart - requests 2.32.4 documentation (no date) Readthedocs.io. Available at: https://requests.readthedocs.io/en/latest/user/quickstart/ (Accessed: June 13, 2025).</w:t>
       </w:r>
     </w:p>
-    <w:p ns2:paraId="1924B885" ns2:textId="23709E5D">
+    <w:p>
       <w:pPr>
         <w:bidi w:val="0"/>
         <w:spacing w:after="240" w:line="360" w:lineRule="auto"/>
@@ -5197,7 +5197,7 @@
         <w:t>Python Software Foundation. (no date) subprocess - Subprocess management. [online] Available at: https://docs.python.org/3/library/subprocess.html.</w:t>
       </w:r>
     </w:p>
-    <w:p ns2:paraId="6F38DAC1" ns2:textId="04C18EF4">
+    <w:p>
       <w:pPr>
         <w:bidi w:val="0"/>
         <w:spacing w:after="240" w:line="360" w:lineRule="auto"/>
@@ -5220,7 +5220,7 @@
         <w:t>AMD (2025). Install TensorFlow for ROCm. [online] Available at: https://rocm.docs.amd.com/projects/install-on-linux/en/latest/install/3rd-party/tensorflow-install.html [Accessed 27 Jun. 2025].</w:t>
       </w:r>
     </w:p>
-    <w:p ns2:paraId="618E6AF9" ns2:textId="2EB21D47">
+    <w:p>
       <w:pPr>
         <w:bidi w:val="0"/>
         <w:spacing w:before="0" w:beforeAutospacing="off" w:after="240" w:afterAutospacing="off" w:line="360" w:lineRule="auto"/>
@@ -5329,7 +5329,7 @@
         <w:t xml:space="preserve"> [Accessed 9 Jul. 2025].</w:t>
       </w:r>
     </w:p>
-    <w:p ns2:paraId="723CA960" ns2:textId="0452E6DF">
+    <w:p>
       <w:pPr>
         <w:bidi w:val="0"/>
         <w:spacing w:before="0" w:beforeAutospacing="off" w:after="240" w:afterAutospacing="off" w:line="360" w:lineRule="auto"/>
@@ -5413,7 +5413,7 @@
         <w:t>.</w:t>
       </w:r>
     </w:p>
-    <w:p ns2:paraId="2CAC9FE6" ns2:textId="6292A292">
+    <w:p>
       <w:pPr>
         <w:bidi w:val="0"/>
         <w:spacing w:before="0" w:beforeAutospacing="off" w:after="240" w:afterAutospacing="off" w:line="360" w:lineRule="auto"/>
@@ -5498,7 +5498,7 @@
         <w:t>.</w:t>
       </w:r>
     </w:p>
-    <w:p ns2:paraId="3FF3F9B7" ns2:textId="057E0C22">
+    <w:p>
       <w:pPr>
         <w:bidi w:val="0"/>
         <w:spacing w:before="0" w:beforeAutospacing="off" w:after="0" w:afterAutospacing="off" w:line="480" w:lineRule="auto"/>
@@ -5561,7 +5561,7 @@
         <w:t>, 2024, numpy.org/. Accessed 24 July 2025.</w:t>
       </w:r>
     </w:p>
-    <w:p ns2:paraId="4DDFEE54" ns2:textId="3BB0044F">
+    <w:p>
       <w:pPr>
         <w:bidi w:val="0"/>
         <w:spacing w:before="0" w:beforeAutospacing="off" w:after="240" w:afterAutospacing="off" w:line="360" w:lineRule="auto"/>
@@ -5623,7 +5623,7 @@
         <w:t xml:space="preserve"> [Accessed 29 Mar. 2026].</w:t>
       </w:r>
     </w:p>
-    <w:p ns2:paraId="01006DBC" ns2:textId="29760FC7">
+    <w:p>
       <w:pPr>
         <w:bidi w:val="0"/>
         <w:spacing w:before="0" w:beforeAutospacing="off" w:after="240" w:afterAutospacing="off" w:line="360" w:lineRule="auto"/>
@@ -5685,7 +5685,7 @@
         <w:t>.</w:t>
       </w:r>
     </w:p>
-    <w:p ns2:paraId="1994A740" ns2:textId="13A5E5F0">
+    <w:p>
       <w:pPr>
         <w:bidi w:val="0"/>
         <w:spacing w:before="0" w:beforeAutospacing="off" w:after="0" w:afterAutospacing="off" w:line="480" w:lineRule="auto"/>
@@ -5699,7 +5699,7 @@
         </w:rPr>
       </w:pPr>
     </w:p>
-    <w:p ns2:paraId="08E0AB14" ns2:textId="5CFEF981">
+    <w:p>
       <w:pPr>
         <w:bidi w:val="0"/>
         <w:spacing w:after="0" w:line="360" w:lineRule="auto"/>
@@ -5719,7 +5719,7 @@
         </w:rPr>
       </w:pPr>
     </w:p>
-    <w:p ns2:paraId="6EEA7561" ns2:textId="42BB344C">
+    <w:p>
       <w:pPr>
         <w:bidi w:val="0"/>
         <w:spacing w:after="0" w:line="360" w:lineRule="auto"/>
@@ -5739,7 +5739,7 @@
         </w:rPr>
       </w:pPr>
     </w:p>
-    <w:p ns2:paraId="5CA9F57F" ns2:textId="251820D2">
+    <w:p>
       <w:pPr>
         <w:bidi w:val="0"/>
         <w:spacing w:after="0" w:line="360" w:lineRule="auto"/>
@@ -5759,7 +5759,7 @@
         </w:rPr>
       </w:pPr>
     </w:p>
-    <w:p ns2:paraId="4ABFAAE5" ns2:textId="124585E8">
+    <w:p>
       <w:pPr>
         <w:bidi w:val="0"/>
         <w:spacing w:after="240" w:line="360" w:lineRule="auto"/>
@@ -5779,7 +5779,7 @@
         </w:rPr>
       </w:pPr>
     </w:p>
-    <w:p ns2:paraId="5AFE37DE" ns2:textId="428C61E0">
+    <w:p>
       <w:pPr>
         <w:bidi w:val="0"/>
         <w:spacing w:after="240" w:line="360" w:lineRule="auto"/>
@@ -5820,7 +5820,7 @@
         </w:r>
       </w:hyperlink>
     </w:p>
-    <w:p ns2:paraId="20FC6CC5" ns2:textId="1F7702CB">
+    <w:p>
       <w:pPr>
         <w:bidi w:val="0"/>
         <w:spacing w:after="240" w:line="360" w:lineRule="auto"/>
@@ -5840,7 +5840,7 @@
         </w:rPr>
       </w:pPr>
     </w:p>
-    <w:p ns2:paraId="7C736180" ns2:textId="12CC26D1">
+    <w:p>
       <w:pPr>
         <w:bidi w:val="0"/>
         <w:rPr>
@@ -5859,7 +5859,7 @@
         </w:rPr>
       </w:pPr>
     </w:p>
-    <w:p ns2:paraId="1A79D9FD" ns2:textId="00C20D89">
+    <w:p>
       <w:pPr>
         <w:pStyle w:val="Normal"/>
         <w:rPr>
@@ -17473,6 +17473,166 @@
     <w:p>
       <w:r>
         <w:br w:type="page"/>
+      </w:r>
+    </w:p>
+    <w:p>
+      <w:pPr>
+        <w:pStyle w:val="Normal"/>
+      </w:pPr>
+      <w:r>
+        <w:t xml:space="preserve"/>
+      </w:r>
+    </w:p>
+    <w:p>
+      <w:pPr>
+        <w:pStyle w:val="Heading1"/>
+      </w:pPr>
+      <w:r>
+        <w:t xml:space="preserve">Website, Remote Training and Deployment Troubleshooting</w:t>
+      </w:r>
+    </w:p>
+    <w:p>
+      <w:pPr>
+        <w:pStyle w:val="BodyText"/>
+      </w:pPr>
+      <w:r>
+        <w:t xml:space="preserve">A later part of the project returned to the original website idea and developed it into a more functional PHP/XAMPP forecast portal. The website is not only a visual prototype. It supports login, registration, ticker search, forecast queue creation, saved graph viewing, health diagnostics and queue debugging. This matters because it connects the machine-learning work back to the original user-facing aim of letting someone request and inspect forecasts through a web interface.</w:t>
+      </w:r>
+    </w:p>
+    <w:p>
+      <w:pPr>
+        <w:pStyle w:val="Heading2"/>
+      </w:pPr>
+      <w:r>
+        <w:t xml:space="preserve">Website structure and queue design</w:t>
+      </w:r>
+    </w:p>
+    <w:p>
+      <w:pPr>
+        <w:pStyle w:val="BodyText"/>
+      </w:pPr>
+      <w:r>
+        <w:t xml:space="preserve">I organised the website around separate PHP pages for the main user journey. `index.php` gives an overview, `login.php` and `register.php` handle account access, `search.php` lets the user find a ticker and request a forecast, `view.php` displays either a queued job or a completed graph, and `queue_debug.php` helps inspect the worker configuration. Shared logic was moved into `web/includes/` so database access, authentication, layout code and job functions were not repeated across every page.</w:t>
+      </w:r>
+    </w:p>
+    <w:p>
+      <w:pPr>
+        <w:pStyle w:val="BodyText"/>
+      </w:pPr>
+      <w:r>
+        <w:t xml:space="preserve">The most important design decision was to use a queue rather than run training directly inside a browser request. Forecasting can take too long for a normal web request, so the site stores work in the `prediction_jobs` table and lets a separate worker process one queued job at a time. Each job now records the requested device, number of epochs, batch size, prediction window, future forecast length and Monte Carlo run count. This makes the system more repeatable because a completed forecast can be linked to the settings that produced it.</w:t>
+      </w:r>
+    </w:p>
+    <w:p>
+      <w:pPr>
+        <w:pStyle w:val="Heading2"/>
+      </w:pPr>
+      <w:r>
+        <w:t xml:space="preserve">Linux-to-Windows SSH integration</w:t>
+      </w:r>
+    </w:p>
+    <w:p>
+      <w:pPr>
+        <w:pStyle w:val="BodyText"/>
+      </w:pPr>
+      <w:r>
+        <w:t xml:space="preserve">The hardest website problem was joining the Linux XAMPP server to the Windows machine that runs the PyTorch scripts. The Linux server needed to start training remotely without manual input, so SSH configuration became part of the application rather than a separate convenience. I had to check the Windows username, SSH host, port, private key path, known hosts file, remote repository path and Python command before the worker could run reliably.</w:t>
+      </w:r>
+    </w:p>
+    <w:p>
+      <w:pPr>
+        <w:pStyle w:val="BodyText"/>
+      </w:pPr>
+      <w:r>
+        <w:t xml:space="preserve">Several SSH problems were environmental rather than coding errors. The Windows OpenSSH server had to be installed, enabled and listening on port 22. Password authentication was confusing because Windows Hello PINs are not the same as the real Windows account password. Key authentication was also affected by the Windows user being in the Administrators group, which meant OpenSSH could check the administrator authorised-keys location rather than the normal user file. These problems showed that remote execution only works when the operating-system setup matches the assumptions in the application config.</w:t>
+      </w:r>
+    </w:p>
+    <w:p>
+      <w:pPr>
+        <w:pStyle w:val="Heading2"/>
+      </w:pPr>
+      <w:r>
+        <w:t xml:space="preserve">Windows command quoting and worker diagnostics</w:t>
+      </w:r>
+    </w:p>
+    <w:p>
+      <w:pPr>
+        <w:pStyle w:val="BodyText"/>
+      </w:pPr>
+      <w:r>
+        <w:t xml:space="preserve">One major worker failure produced the message `''C:' is not recognized as an internal or external command`. This proved that Linux had reached Windows over SSH, but the command being executed on Windows had been damaged by Unix-style quoting. I fixed this by building the remote command as a PowerShell command with Windows-safe string literals. I also added queue diagnostics so I could see the generated PowerShell command and the full SSH command from inside the website.</w:t>
+      </w:r>
+    </w:p>
+    <w:p>
+      <w:pPr>
+        <w:pStyle w:val="BodyText"/>
+      </w:pPr>
+      <w:r>
+        <w:t xml:space="preserve">`queue_debug.php` became an important troubleshooting tool because it checks the PHP CLI binary, worker script, log folder, lock path, SSH key and known-hosts path. It also shows queue counts, running jobs, recent jobs and the worker log tail. This helped separate problems in the browser from problems in PHP, the database, SSH, Windows PowerShell or the Python training process.</w:t>
+      </w:r>
+    </w:p>
+    <w:p>
+      <w:pPr>
+        <w:pStyle w:val="Heading2"/>
+      </w:pPr>
+      <w:r>
+        <w:t xml:space="preserve">Remote helper, manifest import and residual graphs</w:t>
+      </w:r>
+    </w:p>
+    <w:p>
+      <w:pPr>
+        <w:pStyle w:val="BodyText"/>
+      </w:pPr>
+      <w:r>
+        <w:t xml:space="preserve">The Windows-side helper `web/tools/run_remote_prediction_job.py` now runs the separated PyTorch training script, creates graph images headlessly and writes a JSON manifest. The manifest records the job id, ticker, output folder, model file, prediction CSV, forecast CSV, training log, plot paths and statistics such as RMSE, MAE, residual mean and residual standard deviation. This is stronger than guessing filenames from PHP because the worker imports exactly the files reported by the training side.</w:t>
+      </w:r>
+    </w:p>
+    <w:p>
+      <w:pPr>
+        <w:pStyle w:val="BodyText"/>
+      </w:pPr>
+      <w:r>
+        <w:t xml:space="preserve">The web import now supports three graph assets: a summary forecast graph, a detailed forecast graph and a residuals graph. The residuals graph is especially useful for evaluation because it shows the difference between actual and predicted values over the test period. That gives the user more evidence about model error than a forecast curve by itself.</w:t>
+      </w:r>
+    </w:p>
+    <w:p>
+      <w:pPr>
+        <w:pStyle w:val="Heading2"/>
+      </w:pPr>
+      <w:r>
+        <w:t xml:space="preserve">Evidence from a completed web queue run</w:t>
+      </w:r>
+    </w:p>
+    <w:p>
+      <w:pPr>
+        <w:pStyle w:val="BodyText"/>
+      </w:pPr>
+      <w:r>
+        <w:t xml:space="preserve">A successful SOL-USD web queue run produced job 28 under `REWRITE/separated/outputs/web_jobs/sol-usd/job_28/`. The output folder contains the trained model, prediction CSV, 30-day forecast CSV, summary plot, detail plot, residuals plot, training log and `manifest.json`. This is important evidence because it proves that the web queue can call the remote helper, run the training pipeline, generate headless plots and produce the artifacts needed by the website.</w:t>
+      </w:r>
+    </w:p>
+    <w:p>
+      <w:pPr>
+        <w:pStyle w:val="Heading2"/>
+      </w:pPr>
+      <w:r>
+        <w:t xml:space="preserve">Related optimiser and script-hang troubleshooting</w:t>
+      </w:r>
+    </w:p>
+    <w:p>
+      <w:pPr>
+        <w:pStyle w:val="BodyText"/>
+      </w:pPr>
+      <w:r>
+        <w:t xml:space="preserve">During related PyTorch debugging I investigated `torch_optimizer` and confirmed that the installed 0.3.0 version did not include Lion. I compared the available optimisers and selected Lamb because it is fast, layer-adaptive and suitable for deep sequence models such as the LSTM used in this project. I also found that some apparent hangs were not optimizer failures at all; the script was waiting for interactive input such as device selection. This reinforced the need to distinguish model failures from user-input, environment and execution-flow problems.</w:t>
+      </w:r>
+    </w:p>
+    <w:p>
+      <w:pPr>
+        <w:pStyle w:val="Normal"/>
+      </w:pPr>
+      <w:r>
+        <w:t xml:space="preserve"/>
       </w:r>
     </w:p>
     <w:p>

</xml_diff>